<commit_message>
release: prepare v0.4.0 hackathon build
</commit_message>
<xml_diff>
--- a/docs/hackathon/codedecay-submission.docx
+++ b/docs/hackathon/codedecay-submission.docx
@@ -98,7 +98,7 @@
         <w:rPr>
           <w:b/>
         </w:rPr>
-        <w:t>Source:</w:t>
+        <w:t>Three-minute demo:</w:t>
       </w:r>
       <w:r>
         <w:t xml:space="preserve"> </w:t>
@@ -110,7 +110,7 @@
             <w:color w:val="1155CC"/>
             <w:u w:val="single"/>
           </w:rPr>
-          <w:t>View the public repository</w:t>
+          <w:t>Watch the captioned Codex repair</w:t>
         </w:r>
       </w:hyperlink>
     </w:p>
@@ -126,7 +126,7 @@
         <w:rPr>
           <w:b/>
         </w:rPr>
-        <w:t>Current public package:</w:t>
+        <w:t>Source:</w:t>
       </w:r>
       <w:r>
         <w:t xml:space="preserve"> </w:t>
@@ -138,7 +138,7 @@
             <w:color w:val="1155CC"/>
             <w:u w:val="single"/>
           </w:rPr>
-          <w:t>View the npm package</w:t>
+          <w:t>View the public repository</w:t>
         </w:r>
       </w:hyperlink>
     </w:p>
@@ -154,7 +154,7 @@
         <w:rPr>
           <w:b/>
         </w:rPr>
-        <w:t>Current public release:</w:t>
+        <w:t>Current public package:</w:t>
       </w:r>
       <w:r>
         <w:t xml:space="preserve"> </w:t>
@@ -166,7 +166,7 @@
             <w:color w:val="1155CC"/>
             <w:u w:val="single"/>
           </w:rPr>
-          <w:t>View v0.3.5</w:t>
+          <w:t>View the npm package</w:t>
         </w:r>
       </w:hyperlink>
     </w:p>
@@ -182,7 +182,7 @@
         <w:rPr>
           <w:b/>
         </w:rPr>
-        <w:t>Benchmark method and limitations:</w:t>
+        <w:t>Hackathon release:</w:t>
       </w:r>
       <w:r>
         <w:t xml:space="preserve"> </w:t>
@@ -194,6 +194,62 @@
             <w:color w:val="1155CC"/>
             <w:u w:val="single"/>
           </w:rPr>
+          <w:t>View v0.4.0</w:t>
+        </w:r>
+      </w:hyperlink>
+    </w:p>
+    <w:p>
+      <w:pPr>
+        <w:pStyle w:val="CodeDecayListBullet"/>
+        <w:numPr>
+          <w:ilvl w:val="0"/>
+          <w:numId w:val="10"/>
+        </w:numPr>
+      </w:pPr>
+      <w:r>
+        <w:rPr>
+          <w:b/>
+        </w:rPr>
+        <w:t>Release notes:</w:t>
+      </w:r>
+      <w:r>
+        <w:t xml:space="preserve"> </w:t>
+      </w:r>
+      <w:hyperlink r:id="rId14">
+        <w:r>
+          <w:rPr>
+            <w:rFonts w:ascii="Arial" w:hAnsi="Arial"/>
+            <w:color w:val="1155CC"/>
+            <w:u w:val="single"/>
+          </w:rPr>
+          <w:t>Read the shipped behavior and limitations</w:t>
+        </w:r>
+      </w:hyperlink>
+    </w:p>
+    <w:p>
+      <w:pPr>
+        <w:pStyle w:val="CodeDecayListBullet"/>
+        <w:numPr>
+          <w:ilvl w:val="0"/>
+          <w:numId w:val="10"/>
+        </w:numPr>
+      </w:pPr>
+      <w:r>
+        <w:rPr>
+          <w:b/>
+        </w:rPr>
+        <w:t>Benchmark method and limitations:</w:t>
+      </w:r>
+      <w:r>
+        <w:t xml:space="preserve"> </w:t>
+      </w:r>
+      <w:hyperlink r:id="rId15">
+        <w:r>
+          <w:rPr>
+            <w:rFonts w:ascii="Arial" w:hAnsi="Arial"/>
+            <w:color w:val="1155CC"/>
+            <w:u w:val="single"/>
+          </w:rPr>
           <w:t>Read the benchmark corpus documentation</w:t>
         </w:r>
       </w:hyperlink>
@@ -215,7 +271,7 @@
       <w:r>
         <w:t xml:space="preserve"> </w:t>
       </w:r>
-      <w:hyperlink r:id="rId14">
+      <w:hyperlink r:id="rId16">
         <w:r>
           <w:rPr>
             <w:rFonts w:ascii="Arial" w:hAnsi="Arial"/>
@@ -230,7 +286,7 @@
       <w:r>
         <w:t xml:space="preserve">The immutable hackathon release, public video, public Google Doc URL, and final BlockseBlock confirmation are release gates tracked in </w:t>
       </w:r>
-      <w:hyperlink r:id="rId15">
+      <w:hyperlink r:id="rId17">
         <w:r>
           <w:rPr>
             <w:rFonts w:ascii="Arial" w:hAnsi="Arial"/>
@@ -243,7 +299,7 @@
       <w:r>
         <w:t xml:space="preserve">, </w:t>
       </w:r>
-      <w:hyperlink r:id="rId16">
+      <w:hyperlink r:id="rId18">
         <w:r>
           <w:rPr>
             <w:rFonts w:ascii="Arial" w:hAnsi="Arial"/>
@@ -256,7 +312,7 @@
       <w:r>
         <w:t xml:space="preserve">, and </w:t>
       </w:r>
-      <w:hyperlink r:id="rId17">
+      <w:hyperlink r:id="rId19">
         <w:r>
           <w:rPr>
             <w:rFonts w:ascii="Arial" w:hAnsi="Arial"/>
@@ -855,7 +911,7 @@
         </w:numPr>
       </w:pPr>
       <w:r>
-        <w:t>it built, tested, deployed, and anonymously smoke-tested the Judge Lab;</w:t>
+        <w:t>it built, tested, and anonymously smoke-tested the Judge Lab;</w:t>
       </w:r>
     </w:p>
     <w:p>
@@ -880,6 +936,54 @@
       </w:pPr>
       <w:r>
         <w:t>it found and fixed a clean-checkout CI dependency gap;</w:t>
+      </w:r>
+    </w:p>
+    <w:p>
+      <w:pPr>
+        <w:pStyle w:val="CodeDecayListBullet"/>
+        <w:numPr>
+          <w:ilvl w:val="0"/>
+          <w:numId w:val="14"/>
+        </w:numPr>
+      </w:pPr>
+      <w:r>
+        <w:t>it found and fixed contradictory task-bundle safety notes after real checks had executed;</w:t>
+      </w:r>
+    </w:p>
+    <w:p>
+      <w:pPr>
+        <w:pStyle w:val="CodeDecayListBullet"/>
+        <w:numPr>
+          <w:ilvl w:val="0"/>
+          <w:numId w:val="14"/>
+        </w:numPr>
+      </w:pPr>
+      <w:r>
+        <w:t>it replaced generic edge-case lists with ranked, behavior-specific scenarios grounded in changed routes, symbols, flows, requirements, memory, and proof;</w:t>
+      </w:r>
+    </w:p>
+    <w:p>
+      <w:pPr>
+        <w:pStyle w:val="CodeDecayListBullet"/>
+        <w:numPr>
+          <w:ilvl w:val="0"/>
+          <w:numId w:val="14"/>
+        </w:numPr>
+      </w:pPr>
+      <w:r>
+        <w:t>it cleared the release dependency advisories and proved the packed CLI does not install the bundled MCP server's HTTP dependency graph;</w:t>
+      </w:r>
+    </w:p>
+    <w:p>
+      <w:pPr>
+        <w:pStyle w:val="CodeDecayListBullet"/>
+        <w:numPr>
+          <w:ilvl w:val="0"/>
+          <w:numId w:val="14"/>
+        </w:numPr>
+      </w:pPr>
+      <w:r>
+        <w:t>it recorded a genuine Codex repair session with red-before-green endpoint proof, captions, a sanitized transcript, exact commands, and an honest post-repair limitation;</w:t>
       </w:r>
     </w:p>
     <w:p>
@@ -910,7 +1014,7 @@
       <w:r>
         <w:t xml:space="preserve">The public evidence ledger records the issue, components, checks, decisions, commit or pull request, and remaining limitation for each contribution: </w:t>
       </w:r>
-      <w:hyperlink r:id="rId18">
+      <w:hyperlink r:id="rId20">
         <w:r>
           <w:rPr>
             <w:rFonts w:ascii="Arial" w:hAnsi="Arial"/>
@@ -1295,7 +1399,7 @@
       <w:r>
         <w:t xml:space="preserve">These are deterministic fixture-corpus results, not production accuracy. The false positives are intentionally visible. The larger paired real-agent outcome benchmark in </w:t>
       </w:r>
-      <w:hyperlink r:id="rId19">
+      <w:hyperlink r:id="rId21">
         <w:r>
           <w:rPr>
             <w:rFonts w:ascii="Arial" w:hAnsi="Arial"/>
@@ -1517,7 +1621,7 @@
         </w:numPr>
       </w:pPr>
       <w:r>
-        <w:t>public credential-free Judge Lab;</w:t>
+        <w:t>behavior-specific edge-case ranking and overflow evidence;</w:t>
       </w:r>
     </w:p>
     <w:p>
@@ -1529,7 +1633,55 @@
         </w:numPr>
       </w:pPr>
       <w:r>
+        <w:t>truthful agent-task safety limits after configured execution;</w:t>
+      </w:r>
+    </w:p>
+    <w:p>
+      <w:pPr>
+        <w:pStyle w:val="CodeDecayListBullet"/>
+        <w:numPr>
+          <w:ilvl w:val="0"/>
+          <w:numId w:val="19"/>
+        </w:numPr>
+      </w:pPr>
+      <w:r>
+        <w:t>a zero-advisory packed CLI dependency boundary;</w:t>
+      </w:r>
+    </w:p>
+    <w:p>
+      <w:pPr>
+        <w:pStyle w:val="CodeDecayListBullet"/>
+        <w:numPr>
+          <w:ilvl w:val="0"/>
+          <w:numId w:val="19"/>
+        </w:numPr>
+      </w:pPr>
+      <w:r>
+        <w:t>public credential-free Judge Lab;</w:t>
+      </w:r>
+    </w:p>
+    <w:p>
+      <w:pPr>
+        <w:pStyle w:val="CodeDecayListBullet"/>
+        <w:numPr>
+          <w:ilvl w:val="0"/>
+          <w:numId w:val="19"/>
+        </w:numPr>
+      </w:pPr>
+      <w:r>
         <w:t>reproducible weak-test evidence and production acceptance;</w:t>
+      </w:r>
+    </w:p>
+    <w:p>
+      <w:pPr>
+        <w:pStyle w:val="CodeDecayListBullet"/>
+        <w:numPr>
+          <w:ilvl w:val="0"/>
+          <w:numId w:val="19"/>
+        </w:numPr>
+      </w:pPr>
+      <w:r>
+        <w:t>a genuine, reproducible three-minute Codex repair demo;</w:t>
       </w:r>
     </w:p>
     <w:p>
@@ -1652,7 +1804,7 @@
       <w:r>
         <w:t xml:space="preserve">independent three-participant published-workflow UAT in </w:t>
       </w:r>
-      <w:hyperlink r:id="rId20">
+      <w:hyperlink r:id="rId22">
         <w:r>
           <w:rPr>
             <w:rFonts w:ascii="Arial" w:hAnsi="Arial"/>
@@ -1884,7 +2036,7 @@
       <w:r>
         <w:t xml:space="preserve">Published-package proof and the immutable tag, package integrity, release URL, and final source SHA are produced by </w:t>
       </w:r>
-      <w:hyperlink r:id="rId15">
+      <w:hyperlink r:id="rId17">
         <w:r>
           <w:rPr>
             <w:rFonts w:ascii="Arial" w:hAnsi="Arial"/>
@@ -2208,7 +2360,7 @@
             <w:pPr>
               <w:spacing w:before="0" w:after="0" w:line="276" w:lineRule="auto"/>
             </w:pPr>
-            <w:hyperlink r:id="rId21">
+            <w:hyperlink r:id="rId23">
               <w:r>
                 <w:rPr>
                   <w:rFonts w:ascii="Arial" w:hAnsi="Arial"/>
@@ -2398,7 +2550,7 @@
             <w:pPr>
               <w:spacing w:before="0" w:after="0" w:line="276" w:lineRule="auto"/>
             </w:pPr>
-            <w:hyperlink r:id="rId22">
+            <w:hyperlink r:id="rId24">
               <w:r>
                 <w:rPr>
                   <w:rFonts w:ascii="Arial" w:hAnsi="Arial"/>
@@ -2489,7 +2641,7 @@
             <w:pPr>
               <w:spacing w:before="0" w:after="0" w:line="276" w:lineRule="auto"/>
             </w:pPr>
-            <w:hyperlink r:id="rId23">
+            <w:hyperlink r:id="rId25">
               <w:r>
                 <w:rPr>
                   <w:rFonts w:ascii="Arial" w:hAnsi="Arial"/>
@@ -2679,7 +2831,7 @@
             <w:pPr>
               <w:spacing w:before="0" w:after="0" w:line="276" w:lineRule="auto"/>
             </w:pPr>
-            <w:hyperlink r:id="rId24">
+            <w:hyperlink r:id="rId26">
               <w:r>
                 <w:rPr>
                   <w:rFonts w:ascii="Arial" w:hAnsi="Arial"/>
@@ -2770,7 +2922,7 @@
             <w:pPr>
               <w:spacing w:before="0" w:after="0" w:line="276" w:lineRule="auto"/>
             </w:pPr>
-            <w:hyperlink r:id="rId25">
+            <w:hyperlink r:id="rId27">
               <w:r>
                 <w:rPr>
                   <w:rFonts w:ascii="Arial" w:hAnsi="Arial"/>
@@ -2976,7 +3128,7 @@
             <w:pPr>
               <w:spacing w:before="0" w:after="0" w:line="276" w:lineRule="auto"/>
             </w:pPr>
-            <w:hyperlink r:id="rId26">
+            <w:hyperlink r:id="rId28">
               <w:r>
                 <w:rPr>
                   <w:rFonts w:ascii="Arial" w:hAnsi="Arial"/>
@@ -3067,7 +3219,7 @@
             <w:pPr>
               <w:spacing w:before="0" w:after="0" w:line="276" w:lineRule="auto"/>
             </w:pPr>
-            <w:hyperlink r:id="rId27">
+            <w:hyperlink r:id="rId29">
               <w:r>
                 <w:rPr>
                   <w:rFonts w:ascii="Arial" w:hAnsi="Arial"/>
@@ -3241,7 +3393,7 @@
             <w:pPr>
               <w:spacing w:before="0" w:after="0" w:line="276" w:lineRule="auto"/>
             </w:pPr>
-            <w:hyperlink r:id="rId28">
+            <w:hyperlink r:id="rId30">
               <w:r>
                 <w:rPr>
                   <w:rFonts w:ascii="Arial" w:hAnsi="Arial"/>
@@ -3332,7 +3484,7 @@
             <w:pPr>
               <w:spacing w:before="0" w:after="0" w:line="276" w:lineRule="auto"/>
             </w:pPr>
-            <w:hyperlink r:id="rId29">
+            <w:hyperlink r:id="rId31">
               <w:r>
                 <w:rPr>
                   <w:rFonts w:ascii="Arial" w:hAnsi="Arial"/>
@@ -3514,7 +3666,7 @@
             <w:pPr>
               <w:spacing w:before="0" w:after="0" w:line="276" w:lineRule="auto"/>
             </w:pPr>
-            <w:hyperlink r:id="rId30">
+            <w:hyperlink r:id="rId32">
               <w:r>
                 <w:rPr>
                   <w:rFonts w:ascii="Arial" w:hAnsi="Arial"/>
@@ -3588,7 +3740,7 @@
                 <w:color w:val="000000"/>
                 <w:sz w:val="20"/>
               </w:rPr>
-              <w:t>Entry 6 — 27 Jul 2026</w:t>
+              <w:t>Entry 6 — 27 Jul 2026, 19:26</w:t>
             </w:r>
           </w:p>
         </w:tc>
@@ -3623,7 +3775,1083 @@
             <w:pPr>
               <w:spacing w:before="0" w:after="0" w:line="276" w:lineRule="auto"/>
             </w:pPr>
-            <w:hyperlink r:id="rId14">
+            <w:hyperlink r:id="rId33">
+              <w:r>
+                <w:rPr>
+                  <w:rFonts w:ascii="Arial" w:hAnsi="Arial"/>
+                  <w:color w:val="1155CC"/>
+                  <w:u w:val="single"/>
+                </w:rPr>
+                <w:t>#709</w:t>
+              </w:r>
+            </w:hyperlink>
+            <w:r>
+              <w:rPr>
+                <w:rFonts w:ascii="Arial" w:hAnsi="Arial" w:eastAsia="Arial"/>
+                <w:color w:val="000000"/>
+                <w:sz w:val="20"/>
+              </w:rPr>
+              <w:t>: agent bundles and configured execution already existed; dogfooding exposed a contradiction between executed checks and an unconditional no-command limit.</w:t>
+            </w:r>
+          </w:p>
+        </w:tc>
+      </w:tr>
+      <w:tr>
+        <w:tc>
+          <w:tcPr>
+            <w:tcW w:type="dxa" w:w="2160"/>
+            <w:vAlign w:val="center"/>
+          </w:tcPr>
+          <w:p>
+            <w:pPr>
+              <w:spacing w:before="0" w:after="0" w:line="276" w:lineRule="auto"/>
+            </w:pPr>
+            <w:r>
+              <w:rPr>
+                <w:rFonts w:ascii="Arial" w:hAnsi="Arial" w:eastAsia="Arial"/>
+                <w:b/>
+                <w:color w:val="000000"/>
+                <w:sz w:val="20"/>
+              </w:rPr>
+              <w:t>Codex surface and public planning evidence</w:t>
+            </w:r>
+          </w:p>
+        </w:tc>
+        <w:tc>
+          <w:tcPr>
+            <w:tcW w:type="dxa" w:w="7200"/>
+            <w:vAlign w:val="center"/>
+          </w:tcPr>
+          <w:p>
+            <w:pPr>
+              <w:spacing w:before="0" w:after="0" w:line="276" w:lineRule="auto"/>
+            </w:pPr>
+            <w:r>
+              <w:rPr>
+                <w:rFonts w:ascii="Arial" w:hAnsi="Arial" w:eastAsia="Arial"/>
+                <w:color w:val="000000"/>
+                <w:sz w:val="20"/>
+              </w:rPr>
+              <w:t xml:space="preserve">Codex traced the public </w:t>
+            </w:r>
+            <w:r>
+              <w:rPr>
+                <w:rFonts w:ascii="Courier New" w:hAnsi="Courier New" w:eastAsia="Courier New"/>
+                <w:color w:val="000000"/>
+                <w:sz w:val="19"/>
+              </w:rPr>
+              <w:t>codedecay ai --with-checks</w:t>
+            </w:r>
+            <w:r>
+              <w:rPr>
+                <w:rFonts w:ascii="Arial" w:hAnsi="Arial" w:eastAsia="Arial"/>
+                <w:color w:val="000000"/>
+                <w:sz w:val="20"/>
+              </w:rPr>
+              <w:t xml:space="preserve"> path, corrected the evidence-derived limit, and added JSON plus rendered Markdown regression proof.</w:t>
+            </w:r>
+          </w:p>
+        </w:tc>
+      </w:tr>
+      <w:tr>
+        <w:tc>
+          <w:tcPr>
+            <w:tcW w:type="dxa" w:w="2160"/>
+            <w:vAlign w:val="center"/>
+          </w:tcPr>
+          <w:p>
+            <w:pPr>
+              <w:spacing w:before="0" w:after="0" w:line="276" w:lineRule="auto"/>
+            </w:pPr>
+            <w:r>
+              <w:rPr>
+                <w:rFonts w:ascii="Arial" w:hAnsi="Arial" w:eastAsia="Arial"/>
+                <w:b/>
+                <w:color w:val="000000"/>
+                <w:sz w:val="20"/>
+              </w:rPr>
+              <w:t>Files/components changed</w:t>
+            </w:r>
+          </w:p>
+        </w:tc>
+        <w:tc>
+          <w:tcPr>
+            <w:tcW w:type="dxa" w:w="7200"/>
+            <w:vAlign w:val="center"/>
+          </w:tcPr>
+          <w:p>
+            <w:pPr>
+              <w:spacing w:before="0" w:after="0" w:line="276" w:lineRule="auto"/>
+            </w:pPr>
+            <w:r>
+              <w:rPr>
+                <w:rFonts w:ascii="Arial" w:hAnsi="Arial" w:eastAsia="Arial"/>
+                <w:color w:val="000000"/>
+                <w:sz w:val="20"/>
+              </w:rPr>
+              <w:t>Agent task-bundle safety limits and AI workflow tests.</w:t>
+            </w:r>
+          </w:p>
+        </w:tc>
+      </w:tr>
+      <w:tr>
+        <w:tc>
+          <w:tcPr>
+            <w:tcW w:type="dxa" w:w="2160"/>
+            <w:vAlign w:val="center"/>
+          </w:tcPr>
+          <w:p>
+            <w:pPr>
+              <w:spacing w:before="0" w:after="0" w:line="276" w:lineRule="auto"/>
+            </w:pPr>
+            <w:r>
+              <w:rPr>
+                <w:rFonts w:ascii="Arial" w:hAnsi="Arial" w:eastAsia="Arial"/>
+                <w:b/>
+                <w:color w:val="000000"/>
+                <w:sz w:val="20"/>
+              </w:rPr>
+              <w:t>Commands and tests executed</w:t>
+            </w:r>
+          </w:p>
+        </w:tc>
+        <w:tc>
+          <w:tcPr>
+            <w:tcW w:type="dxa" w:w="7200"/>
+            <w:vAlign w:val="center"/>
+          </w:tcPr>
+          <w:p>
+            <w:pPr>
+              <w:spacing w:before="0" w:after="0" w:line="276" w:lineRule="auto"/>
+            </w:pPr>
+            <w:r>
+              <w:rPr>
+                <w:rFonts w:ascii="Arial" w:hAnsi="Arial" w:eastAsia="Arial"/>
+                <w:color w:val="000000"/>
+                <w:sz w:val="20"/>
+              </w:rPr>
+              <w:t>Focused agent/AI tests, full suite, lint, typecheck, build, package dry-run, GitHub checks.</w:t>
+            </w:r>
+          </w:p>
+        </w:tc>
+      </w:tr>
+      <w:tr>
+        <w:tc>
+          <w:tcPr>
+            <w:tcW w:type="dxa" w:w="2160"/>
+            <w:vAlign w:val="center"/>
+          </w:tcPr>
+          <w:p>
+            <w:pPr>
+              <w:spacing w:before="0" w:after="0" w:line="276" w:lineRule="auto"/>
+            </w:pPr>
+            <w:r>
+              <w:rPr>
+                <w:rFonts w:ascii="Arial" w:hAnsi="Arial" w:eastAsia="Arial"/>
+                <w:b/>
+                <w:color w:val="000000"/>
+                <w:sz w:val="20"/>
+              </w:rPr>
+              <w:t>Human decision, public result, and remaining limitation</w:t>
+            </w:r>
+          </w:p>
+        </w:tc>
+        <w:tc>
+          <w:tcPr>
+            <w:tcW w:type="dxa" w:w="7200"/>
+            <w:vAlign w:val="center"/>
+          </w:tcPr>
+          <w:p>
+            <w:pPr>
+              <w:spacing w:before="0" w:after="0" w:line="276" w:lineRule="auto"/>
+            </w:pPr>
+            <w:hyperlink r:id="rId34">
+              <w:r>
+                <w:rPr>
+                  <w:rFonts w:ascii="Arial" w:hAnsi="Arial"/>
+                  <w:color w:val="1155CC"/>
+                  <w:u w:val="single"/>
+                </w:rPr>
+                <w:t>PR #711</w:t>
+              </w:r>
+            </w:hyperlink>
+            <w:r>
+              <w:rPr>
+                <w:rFonts w:ascii="Arial" w:hAnsi="Arial" w:eastAsia="Arial"/>
+                <w:color w:val="000000"/>
+                <w:sz w:val="20"/>
+              </w:rPr>
+              <w:t xml:space="preserve">, commit </w:t>
+            </w:r>
+            <w:r>
+              <w:rPr>
+                <w:rFonts w:ascii="Courier New" w:hAnsi="Courier New" w:eastAsia="Courier New"/>
+                <w:color w:val="000000"/>
+                <w:sz w:val="19"/>
+              </w:rPr>
+              <w:t>06a6dae</w:t>
+            </w:r>
+            <w:r>
+              <w:rPr>
+                <w:rFonts w:ascii="Arial" w:hAnsi="Arial" w:eastAsia="Arial"/>
+                <w:color w:val="000000"/>
+                <w:sz w:val="20"/>
+              </w:rPr>
+              <w:t>. Limitation: the bundle reports configured execution state; it does not infer unobserved external actions.</w:t>
+            </w:r>
+          </w:p>
+        </w:tc>
+      </w:tr>
+      <w:tr>
+        <w:tc>
+          <w:tcPr>
+            <w:tcW w:type="dxa" w:w="7200"/>
+            <w:gridSpan w:val="2"/>
+            <w:vAlign w:val="center"/>
+          </w:tcPr>
+          <w:p>
+            <w:pPr>
+              <w:keepNext/>
+              <w:spacing w:before="0" w:after="0" w:line="276" w:lineRule="auto"/>
+            </w:pPr>
+            <w:r>
+              <w:rPr>
+                <w:rFonts w:ascii="Arial" w:hAnsi="Arial" w:eastAsia="Arial"/>
+                <w:b/>
+                <w:color w:val="000000"/>
+                <w:sz w:val="20"/>
+              </w:rPr>
+              <w:t>Entry 7 — 27 Jul 2026, 19:41</w:t>
+            </w:r>
+          </w:p>
+        </w:tc>
+      </w:tr>
+      <w:tr>
+        <w:tc>
+          <w:tcPr>
+            <w:tcW w:type="dxa" w:w="2160"/>
+            <w:vAlign w:val="center"/>
+          </w:tcPr>
+          <w:p>
+            <w:pPr>
+              <w:spacing w:before="0" w:after="0" w:line="276" w:lineRule="auto"/>
+            </w:pPr>
+            <w:r>
+              <w:rPr>
+                <w:rFonts w:ascii="Arial" w:hAnsi="Arial" w:eastAsia="Arial"/>
+                <w:b/>
+                <w:color w:val="000000"/>
+                <w:sz w:val="20"/>
+              </w:rPr>
+              <w:t>Issue/task and foundation boundary</w:t>
+            </w:r>
+          </w:p>
+        </w:tc>
+        <w:tc>
+          <w:tcPr>
+            <w:tcW w:type="dxa" w:w="7200"/>
+            <w:vAlign w:val="center"/>
+          </w:tcPr>
+          <w:p>
+            <w:pPr>
+              <w:spacing w:before="0" w:after="0" w:line="276" w:lineRule="auto"/>
+            </w:pPr>
+            <w:hyperlink r:id="rId35">
+              <w:r>
+                <w:rPr>
+                  <w:rFonts w:ascii="Arial" w:hAnsi="Arial"/>
+                  <w:color w:val="1155CC"/>
+                  <w:u w:val="single"/>
+                </w:rPr>
+                <w:t>#710</w:t>
+              </w:r>
+            </w:hyperlink>
+            <w:r>
+              <w:rPr>
+                <w:rFonts w:ascii="Arial" w:hAnsi="Arial" w:eastAsia="Arial"/>
+                <w:color w:val="000000"/>
+                <w:sz w:val="20"/>
+              </w:rPr>
+              <w:t>: the CLI and MCP server were already shipped; the release audit found transitive dependency advisories and an unnecessarily installed server graph.</w:t>
+            </w:r>
+          </w:p>
+        </w:tc>
+      </w:tr>
+      <w:tr>
+        <w:tc>
+          <w:tcPr>
+            <w:tcW w:type="dxa" w:w="2160"/>
+            <w:vAlign w:val="center"/>
+          </w:tcPr>
+          <w:p>
+            <w:pPr>
+              <w:spacing w:before="0" w:after="0" w:line="276" w:lineRule="auto"/>
+            </w:pPr>
+            <w:r>
+              <w:rPr>
+                <w:rFonts w:ascii="Arial" w:hAnsi="Arial" w:eastAsia="Arial"/>
+                <w:b/>
+                <w:color w:val="000000"/>
+                <w:sz w:val="20"/>
+              </w:rPr>
+              <w:t>Codex surface and public planning evidence</w:t>
+            </w:r>
+          </w:p>
+        </w:tc>
+        <w:tc>
+          <w:tcPr>
+            <w:tcW w:type="dxa" w:w="7200"/>
+            <w:vAlign w:val="center"/>
+          </w:tcPr>
+          <w:p>
+            <w:pPr>
+              <w:spacing w:before="0" w:after="0" w:line="276" w:lineRule="auto"/>
+            </w:pPr>
+            <w:r>
+              <w:rPr>
+                <w:rFonts w:ascii="Arial" w:hAnsi="Arial" w:eastAsia="Arial"/>
+                <w:color w:val="000000"/>
+                <w:sz w:val="20"/>
+              </w:rPr>
+              <w:t>Codex inspected the dependency paths, raised patched floors, bundled the MCP server surface, and added a fresh packed-consumer proof.</w:t>
+            </w:r>
+          </w:p>
+        </w:tc>
+      </w:tr>
+      <w:tr>
+        <w:tc>
+          <w:tcPr>
+            <w:tcW w:type="dxa" w:w="2160"/>
+            <w:vAlign w:val="center"/>
+          </w:tcPr>
+          <w:p>
+            <w:pPr>
+              <w:spacing w:before="0" w:after="0" w:line="276" w:lineRule="auto"/>
+            </w:pPr>
+            <w:r>
+              <w:rPr>
+                <w:rFonts w:ascii="Arial" w:hAnsi="Arial" w:eastAsia="Arial"/>
+                <w:b/>
+                <w:color w:val="000000"/>
+                <w:sz w:val="20"/>
+              </w:rPr>
+              <w:t>Files/components changed</w:t>
+            </w:r>
+          </w:p>
+        </w:tc>
+        <w:tc>
+          <w:tcPr>
+            <w:tcW w:type="dxa" w:w="7200"/>
+            <w:vAlign w:val="center"/>
+          </w:tcPr>
+          <w:p>
+            <w:pPr>
+              <w:spacing w:before="0" w:after="0" w:line="276" w:lineRule="auto"/>
+            </w:pPr>
+            <w:r>
+              <w:rPr>
+                <w:rFonts w:ascii="Arial" w:hAnsi="Arial" w:eastAsia="Arial"/>
+                <w:color w:val="000000"/>
+                <w:sz w:val="20"/>
+              </w:rPr>
+              <w:t>Lockfile policy, dependency resolutions, CLI bundling, packed MCP smoke.</w:t>
+            </w:r>
+          </w:p>
+        </w:tc>
+      </w:tr>
+      <w:tr>
+        <w:tc>
+          <w:tcPr>
+            <w:tcW w:type="dxa" w:w="2160"/>
+            <w:vAlign w:val="center"/>
+          </w:tcPr>
+          <w:p>
+            <w:pPr>
+              <w:spacing w:before="0" w:after="0" w:line="276" w:lineRule="auto"/>
+            </w:pPr>
+            <w:r>
+              <w:rPr>
+                <w:rFonts w:ascii="Arial" w:hAnsi="Arial" w:eastAsia="Arial"/>
+                <w:b/>
+                <w:color w:val="000000"/>
+                <w:sz w:val="20"/>
+              </w:rPr>
+              <w:t>Commands and tests executed</w:t>
+            </w:r>
+          </w:p>
+        </w:tc>
+        <w:tc>
+          <w:tcPr>
+            <w:tcW w:type="dxa" w:w="7200"/>
+            <w:vAlign w:val="center"/>
+          </w:tcPr>
+          <w:p>
+            <w:pPr>
+              <w:spacing w:before="0" w:after="0" w:line="276" w:lineRule="auto"/>
+            </w:pPr>
+            <w:r>
+              <w:rPr>
+                <w:rFonts w:ascii="Arial" w:hAnsi="Arial" w:eastAsia="Arial"/>
+                <w:color w:val="000000"/>
+                <w:sz w:val="20"/>
+              </w:rPr>
+              <w:t>Full suite, audits at moderate and production scopes, build, package dry-run, child-repository E2E, fresh packed install.</w:t>
+            </w:r>
+          </w:p>
+        </w:tc>
+      </w:tr>
+      <w:tr>
+        <w:tc>
+          <w:tcPr>
+            <w:tcW w:type="dxa" w:w="2160"/>
+            <w:vAlign w:val="center"/>
+          </w:tcPr>
+          <w:p>
+            <w:pPr>
+              <w:spacing w:before="0" w:after="0" w:line="276" w:lineRule="auto"/>
+            </w:pPr>
+            <w:r>
+              <w:rPr>
+                <w:rFonts w:ascii="Arial" w:hAnsi="Arial" w:eastAsia="Arial"/>
+                <w:b/>
+                <w:color w:val="000000"/>
+                <w:sz w:val="20"/>
+              </w:rPr>
+              <w:t>Human decision, public result, and remaining limitation</w:t>
+            </w:r>
+          </w:p>
+        </w:tc>
+        <w:tc>
+          <w:tcPr>
+            <w:tcW w:type="dxa" w:w="7200"/>
+            <w:vAlign w:val="center"/>
+          </w:tcPr>
+          <w:p>
+            <w:pPr>
+              <w:spacing w:before="0" w:after="0" w:line="276" w:lineRule="auto"/>
+            </w:pPr>
+            <w:hyperlink r:id="rId36">
+              <w:r>
+                <w:rPr>
+                  <w:rFonts w:ascii="Arial" w:hAnsi="Arial"/>
+                  <w:color w:val="1155CC"/>
+                  <w:u w:val="single"/>
+                </w:rPr>
+                <w:t>PR #714</w:t>
+              </w:r>
+            </w:hyperlink>
+            <w:r>
+              <w:rPr>
+                <w:rFonts w:ascii="Arial" w:hAnsi="Arial" w:eastAsia="Arial"/>
+                <w:color w:val="000000"/>
+                <w:sz w:val="20"/>
+              </w:rPr>
+              <w:t xml:space="preserve">, commit </w:t>
+            </w:r>
+            <w:r>
+              <w:rPr>
+                <w:rFonts w:ascii="Courier New" w:hAnsi="Courier New" w:eastAsia="Courier New"/>
+                <w:color w:val="000000"/>
+                <w:sz w:val="19"/>
+              </w:rPr>
+              <w:t>528a384</w:t>
+            </w:r>
+            <w:r>
+              <w:rPr>
+                <w:rFonts w:ascii="Arial" w:hAnsi="Arial" w:eastAsia="Arial"/>
+                <w:color w:val="000000"/>
+                <w:sz w:val="20"/>
+              </w:rPr>
+              <w:t>. All seven repository alerts closed and production audit reached zero advisories. Limitation: future dependency updates still require recurring audit.</w:t>
+            </w:r>
+          </w:p>
+        </w:tc>
+      </w:tr>
+      <w:tr>
+        <w:tc>
+          <w:tcPr>
+            <w:tcW w:type="dxa" w:w="7200"/>
+            <w:gridSpan w:val="2"/>
+            <w:vAlign w:val="center"/>
+          </w:tcPr>
+          <w:p>
+            <w:pPr>
+              <w:keepNext/>
+              <w:spacing w:before="0" w:after="0" w:line="276" w:lineRule="auto"/>
+            </w:pPr>
+            <w:r>
+              <w:rPr>
+                <w:rFonts w:ascii="Arial" w:hAnsi="Arial" w:eastAsia="Arial"/>
+                <w:b/>
+                <w:color w:val="000000"/>
+                <w:sz w:val="20"/>
+              </w:rPr>
+              <w:t>Entry 8 — 27 Jul 2026, 20:00</w:t>
+            </w:r>
+          </w:p>
+        </w:tc>
+      </w:tr>
+      <w:tr>
+        <w:tc>
+          <w:tcPr>
+            <w:tcW w:type="dxa" w:w="2160"/>
+            <w:vAlign w:val="center"/>
+          </w:tcPr>
+          <w:p>
+            <w:pPr>
+              <w:spacing w:before="0" w:after="0" w:line="276" w:lineRule="auto"/>
+            </w:pPr>
+            <w:r>
+              <w:rPr>
+                <w:rFonts w:ascii="Arial" w:hAnsi="Arial" w:eastAsia="Arial"/>
+                <w:b/>
+                <w:color w:val="000000"/>
+                <w:sz w:val="20"/>
+              </w:rPr>
+              <w:t>Issue/task and foundation boundary</w:t>
+            </w:r>
+          </w:p>
+        </w:tc>
+        <w:tc>
+          <w:tcPr>
+            <w:tcW w:type="dxa" w:w="7200"/>
+            <w:vAlign w:val="center"/>
+          </w:tcPr>
+          <w:p>
+            <w:pPr>
+              <w:spacing w:before="0" w:after="0" w:line="276" w:lineRule="auto"/>
+            </w:pPr>
+            <w:hyperlink r:id="rId29">
+              <w:r>
+                <w:rPr>
+                  <w:rFonts w:ascii="Arial" w:hAnsi="Arial"/>
+                  <w:color w:val="1155CC"/>
+                  <w:u w:val="single"/>
+                </w:rPr>
+                <w:t>#666</w:t>
+              </w:r>
+            </w:hyperlink>
+            <w:r>
+              <w:rPr>
+                <w:rFonts w:ascii="Arial" w:hAnsi="Arial" w:eastAsia="Arial"/>
+                <w:color w:val="000000"/>
+                <w:sz w:val="20"/>
+              </w:rPr>
+              <w:t>: deterministic edge-case generation existed; the completed hackathon work replaced generic checklists with behavior-specific ranked scenarios and explicit overflow.</w:t>
+            </w:r>
+          </w:p>
+        </w:tc>
+      </w:tr>
+      <w:tr>
+        <w:tc>
+          <w:tcPr>
+            <w:tcW w:type="dxa" w:w="2160"/>
+            <w:vAlign w:val="center"/>
+          </w:tcPr>
+          <w:p>
+            <w:pPr>
+              <w:spacing w:before="0" w:after="0" w:line="276" w:lineRule="auto"/>
+            </w:pPr>
+            <w:r>
+              <w:rPr>
+                <w:rFonts w:ascii="Arial" w:hAnsi="Arial" w:eastAsia="Arial"/>
+                <w:b/>
+                <w:color w:val="000000"/>
+                <w:sz w:val="20"/>
+              </w:rPr>
+              <w:t>Codex surface and public planning evidence</w:t>
+            </w:r>
+          </w:p>
+        </w:tc>
+        <w:tc>
+          <w:tcPr>
+            <w:tcW w:type="dxa" w:w="7200"/>
+            <w:vAlign w:val="center"/>
+          </w:tcPr>
+          <w:p>
+            <w:pPr>
+              <w:spacing w:before="0" w:after="0" w:line="276" w:lineRule="auto"/>
+            </w:pPr>
+            <w:r>
+              <w:rPr>
+                <w:rFonts w:ascii="Arial" w:hAnsi="Arial" w:eastAsia="Arial"/>
+                <w:color w:val="000000"/>
+                <w:sz w:val="20"/>
+              </w:rPr>
+              <w:t>Codex compared before/after child-repository output, scoped scenarios to changed routes and symbols, killed deliberate mutants, and separated scenario tasks from proof tasks.</w:t>
+            </w:r>
+          </w:p>
+        </w:tc>
+      </w:tr>
+      <w:tr>
+        <w:tc>
+          <w:tcPr>
+            <w:tcW w:type="dxa" w:w="2160"/>
+            <w:vAlign w:val="center"/>
+          </w:tcPr>
+          <w:p>
+            <w:pPr>
+              <w:spacing w:before="0" w:after="0" w:line="276" w:lineRule="auto"/>
+            </w:pPr>
+            <w:r>
+              <w:rPr>
+                <w:rFonts w:ascii="Arial" w:hAnsi="Arial" w:eastAsia="Arial"/>
+                <w:b/>
+                <w:color w:val="000000"/>
+                <w:sz w:val="20"/>
+              </w:rPr>
+              <w:t>Files/components changed</w:t>
+            </w:r>
+          </w:p>
+        </w:tc>
+        <w:tc>
+          <w:tcPr>
+            <w:tcW w:type="dxa" w:w="7200"/>
+            <w:vAlign w:val="center"/>
+          </w:tcPr>
+          <w:p>
+            <w:pPr>
+              <w:spacing w:before="0" w:after="0" w:line="276" w:lineRule="auto"/>
+            </w:pPr>
+            <w:r>
+              <w:rPr>
+                <w:rFonts w:ascii="Arial" w:hAnsi="Arial" w:eastAsia="Arial"/>
+                <w:color w:val="000000"/>
+                <w:sz w:val="20"/>
+              </w:rPr>
+              <w:t>Red-team scenario model/ranking, JSON/Markdown/MCP/agent output, PR-safety benchmark relevance metrics, docs.</w:t>
+            </w:r>
+          </w:p>
+        </w:tc>
+      </w:tr>
+      <w:tr>
+        <w:tc>
+          <w:tcPr>
+            <w:tcW w:type="dxa" w:w="2160"/>
+            <w:vAlign w:val="center"/>
+          </w:tcPr>
+          <w:p>
+            <w:pPr>
+              <w:spacing w:before="0" w:after="0" w:line="276" w:lineRule="auto"/>
+            </w:pPr>
+            <w:r>
+              <w:rPr>
+                <w:rFonts w:ascii="Arial" w:hAnsi="Arial" w:eastAsia="Arial"/>
+                <w:b/>
+                <w:color w:val="000000"/>
+                <w:sz w:val="20"/>
+              </w:rPr>
+              <w:t>Commands and tests executed</w:t>
+            </w:r>
+          </w:p>
+        </w:tc>
+        <w:tc>
+          <w:tcPr>
+            <w:tcW w:type="dxa" w:w="7200"/>
+            <w:vAlign w:val="center"/>
+          </w:tcPr>
+          <w:p>
+            <w:pPr>
+              <w:spacing w:before="0" w:after="0" w:line="276" w:lineRule="auto"/>
+            </w:pPr>
+            <w:r>
+              <w:rPr>
+                <w:rFonts w:ascii="Arial" w:hAnsi="Arial" w:eastAsia="Arial"/>
+                <w:color w:val="000000"/>
+                <w:sz w:val="20"/>
+              </w:rPr>
+              <w:t>75 focused tests, 665-test full suite, lint, typecheck, build, benchmark, PR-safety eval, packed UAT, seven mutation checks.</w:t>
+            </w:r>
+          </w:p>
+        </w:tc>
+      </w:tr>
+      <w:tr>
+        <w:tc>
+          <w:tcPr>
+            <w:tcW w:type="dxa" w:w="2160"/>
+            <w:vAlign w:val="center"/>
+          </w:tcPr>
+          <w:p>
+            <w:pPr>
+              <w:spacing w:before="0" w:after="0" w:line="276" w:lineRule="auto"/>
+            </w:pPr>
+            <w:r>
+              <w:rPr>
+                <w:rFonts w:ascii="Arial" w:hAnsi="Arial" w:eastAsia="Arial"/>
+                <w:b/>
+                <w:color w:val="000000"/>
+                <w:sz w:val="20"/>
+              </w:rPr>
+              <w:t>Human decision, public result, and remaining limitation</w:t>
+            </w:r>
+          </w:p>
+        </w:tc>
+        <w:tc>
+          <w:tcPr>
+            <w:tcW w:type="dxa" w:w="7200"/>
+            <w:vAlign w:val="center"/>
+          </w:tcPr>
+          <w:p>
+            <w:pPr>
+              <w:spacing w:before="0" w:after="0" w:line="276" w:lineRule="auto"/>
+            </w:pPr>
+            <w:hyperlink r:id="rId37">
+              <w:r>
+                <w:rPr>
+                  <w:rFonts w:ascii="Arial" w:hAnsi="Arial"/>
+                  <w:color w:val="1155CC"/>
+                  <w:u w:val="single"/>
+                </w:rPr>
+                <w:t>PR #715</w:t>
+              </w:r>
+            </w:hyperlink>
+            <w:r>
+              <w:rPr>
+                <w:rFonts w:ascii="Arial" w:hAnsi="Arial" w:eastAsia="Arial"/>
+                <w:color w:val="000000"/>
+                <w:sz w:val="20"/>
+              </w:rPr>
+              <w:t xml:space="preserve">, commit </w:t>
+            </w:r>
+            <w:r>
+              <w:rPr>
+                <w:rFonts w:ascii="Courier New" w:hAnsi="Courier New" w:eastAsia="Courier New"/>
+                <w:color w:val="000000"/>
+                <w:sz w:val="19"/>
+              </w:rPr>
+              <w:t>f931044</w:t>
+            </w:r>
+            <w:r>
+              <w:rPr>
+                <w:rFonts w:ascii="Arial" w:hAnsi="Arial" w:eastAsia="Arial"/>
+                <w:color w:val="000000"/>
+                <w:sz w:val="20"/>
+              </w:rPr>
+              <w:t>. The measured fixture result was 100% scenario relevance and 0% noise; this is not a production-accuracy claim.</w:t>
+            </w:r>
+          </w:p>
+        </w:tc>
+      </w:tr>
+      <w:tr>
+        <w:tc>
+          <w:tcPr>
+            <w:tcW w:type="dxa" w:w="7200"/>
+            <w:gridSpan w:val="2"/>
+            <w:vAlign w:val="center"/>
+          </w:tcPr>
+          <w:p>
+            <w:pPr>
+              <w:keepNext/>
+              <w:spacing w:before="0" w:after="0" w:line="276" w:lineRule="auto"/>
+            </w:pPr>
+            <w:r>
+              <w:rPr>
+                <w:rFonts w:ascii="Arial" w:hAnsi="Arial" w:eastAsia="Arial"/>
+                <w:b/>
+                <w:color w:val="000000"/>
+                <w:sz w:val="20"/>
+              </w:rPr>
+              <w:t>Entry 9 — 27 Jul 2026, 20:18</w:t>
+            </w:r>
+          </w:p>
+        </w:tc>
+      </w:tr>
+      <w:tr>
+        <w:tc>
+          <w:tcPr>
+            <w:tcW w:type="dxa" w:w="2160"/>
+            <w:vAlign w:val="center"/>
+          </w:tcPr>
+          <w:p>
+            <w:pPr>
+              <w:spacing w:before="0" w:after="0" w:line="276" w:lineRule="auto"/>
+            </w:pPr>
+            <w:r>
+              <w:rPr>
+                <w:rFonts w:ascii="Arial" w:hAnsi="Arial" w:eastAsia="Arial"/>
+                <w:b/>
+                <w:color w:val="000000"/>
+                <w:sz w:val="20"/>
+              </w:rPr>
+              <w:t>Issue/task and foundation boundary</w:t>
+            </w:r>
+          </w:p>
+        </w:tc>
+        <w:tc>
+          <w:tcPr>
+            <w:tcW w:type="dxa" w:w="7200"/>
+            <w:vAlign w:val="center"/>
+          </w:tcPr>
+          <w:p>
+            <w:pPr>
+              <w:spacing w:before="0" w:after="0" w:line="276" w:lineRule="auto"/>
+            </w:pPr>
+            <w:hyperlink r:id="rId18">
+              <w:r>
+                <w:rPr>
+                  <w:rFonts w:ascii="Arial" w:hAnsi="Arial"/>
+                  <w:color w:val="1155CC"/>
+                  <w:u w:val="single"/>
+                </w:rPr>
+                <w:t>#696</w:t>
+              </w:r>
+            </w:hyperlink>
+            <w:r>
+              <w:rPr>
+                <w:rFonts w:ascii="Arial" w:hAnsi="Arial" w:eastAsia="Arial"/>
+                <w:color w:val="000000"/>
+                <w:sz w:val="20"/>
+              </w:rPr>
+              <w:t>: the product and deterministic demo fixture existed; the hackathon change captured a genuine Codex repair loop and made its proof inspectable.</w:t>
+            </w:r>
+          </w:p>
+        </w:tc>
+      </w:tr>
+      <w:tr>
+        <w:tc>
+          <w:tcPr>
+            <w:tcW w:type="dxa" w:w="2160"/>
+            <w:vAlign w:val="center"/>
+          </w:tcPr>
+          <w:p>
+            <w:pPr>
+              <w:spacing w:before="0" w:after="0" w:line="276" w:lineRule="auto"/>
+            </w:pPr>
+            <w:r>
+              <w:rPr>
+                <w:rFonts w:ascii="Arial" w:hAnsi="Arial" w:eastAsia="Arial"/>
+                <w:b/>
+                <w:color w:val="000000"/>
+                <w:sz w:val="20"/>
+              </w:rPr>
+              <w:t>Codex surface and public planning evidence</w:t>
+            </w:r>
+          </w:p>
+        </w:tc>
+        <w:tc>
+          <w:tcPr>
+            <w:tcW w:type="dxa" w:w="7200"/>
+            <w:vAlign w:val="center"/>
+          </w:tcPr>
+          <w:p>
+            <w:pPr>
+              <w:spacing w:before="0" w:after="0" w:line="276" w:lineRule="auto"/>
+            </w:pPr>
+            <w:r>
+              <w:rPr>
+                <w:rFonts w:ascii="Arial" w:hAnsi="Arial" w:eastAsia="Arial"/>
+                <w:color w:val="000000"/>
+                <w:sz w:val="20"/>
+              </w:rPr>
+              <w:t>Codex planned the repair, ran the narrow test, used CodeDecay, added a real endpoint test, observed the red auth failure, fixed the route, reran approved checks, and self-reviewed the remaining uncertainty.</w:t>
+            </w:r>
+          </w:p>
+        </w:tc>
+      </w:tr>
+      <w:tr>
+        <w:tc>
+          <w:tcPr>
+            <w:tcW w:type="dxa" w:w="2160"/>
+            <w:vAlign w:val="center"/>
+          </w:tcPr>
+          <w:p>
+            <w:pPr>
+              <w:spacing w:before="0" w:after="0" w:line="276" w:lineRule="auto"/>
+            </w:pPr>
+            <w:r>
+              <w:rPr>
+                <w:rFonts w:ascii="Arial" w:hAnsi="Arial" w:eastAsia="Arial"/>
+                <w:b/>
+                <w:color w:val="000000"/>
+                <w:sz w:val="20"/>
+              </w:rPr>
+              <w:t>Files/components changed</w:t>
+            </w:r>
+          </w:p>
+        </w:tc>
+        <w:tc>
+          <w:tcPr>
+            <w:tcW w:type="dxa" w:w="7200"/>
+            <w:vAlign w:val="center"/>
+          </w:tcPr>
+          <w:p>
+            <w:pPr>
+              <w:spacing w:before="0" w:after="0" w:line="276" w:lineRule="auto"/>
+            </w:pPr>
+            <w:r>
+              <w:rPr>
+                <w:rFonts w:ascii="Arial" w:hAnsi="Arial" w:eastAsia="Arial"/>
+                <w:color w:val="000000"/>
+                <w:sz w:val="20"/>
+              </w:rPr>
+              <w:t>Reproducible fixture, sanitized session JSONL, evidence index, cut disclosure, captions, 159.46-second 1080p video, Judge Lab embed and tests.</w:t>
+            </w:r>
+          </w:p>
+        </w:tc>
+      </w:tr>
+      <w:tr>
+        <w:tc>
+          <w:tcPr>
+            <w:tcW w:type="dxa" w:w="2160"/>
+            <w:vAlign w:val="center"/>
+          </w:tcPr>
+          <w:p>
+            <w:pPr>
+              <w:spacing w:before="0" w:after="0" w:line="276" w:lineRule="auto"/>
+            </w:pPr>
+            <w:r>
+              <w:rPr>
+                <w:rFonts w:ascii="Arial" w:hAnsi="Arial" w:eastAsia="Arial"/>
+                <w:b/>
+                <w:color w:val="000000"/>
+                <w:sz w:val="20"/>
+              </w:rPr>
+              <w:t>Commands and tests executed</w:t>
+            </w:r>
+          </w:p>
+        </w:tc>
+        <w:tc>
+          <w:tcPr>
+            <w:tcW w:type="dxa" w:w="7200"/>
+            <w:vAlign w:val="center"/>
+          </w:tcPr>
+          <w:p>
+            <w:pPr>
+              <w:spacing w:before="0" w:after="0" w:line="276" w:lineRule="auto"/>
+            </w:pPr>
+            <w:r>
+              <w:rPr>
+                <w:rFonts w:ascii="Arial" w:hAnsi="Arial" w:eastAsia="Arial"/>
+                <w:color w:val="000000"/>
+                <w:sz w:val="20"/>
+              </w:rPr>
+              <w:t>Fixture determinism, media probe, 669-test suite, lint, typecheck, build, package dry-run, audits, Judge Lab server and 10 browser tests, GitHub checks.</w:t>
+            </w:r>
+          </w:p>
+        </w:tc>
+      </w:tr>
+      <w:tr>
+        <w:tc>
+          <w:tcPr>
+            <w:tcW w:type="dxa" w:w="2160"/>
+            <w:vAlign w:val="center"/>
+          </w:tcPr>
+          <w:p>
+            <w:pPr>
+              <w:spacing w:before="0" w:after="0" w:line="276" w:lineRule="auto"/>
+            </w:pPr>
+            <w:r>
+              <w:rPr>
+                <w:rFonts w:ascii="Arial" w:hAnsi="Arial" w:eastAsia="Arial"/>
+                <w:b/>
+                <w:color w:val="000000"/>
+                <w:sz w:val="20"/>
+              </w:rPr>
+              <w:t>Human decision, public result, and remaining limitation</w:t>
+            </w:r>
+          </w:p>
+        </w:tc>
+        <w:tc>
+          <w:tcPr>
+            <w:tcW w:type="dxa" w:w="7200"/>
+            <w:vAlign w:val="center"/>
+          </w:tcPr>
+          <w:p>
+            <w:pPr>
+              <w:spacing w:before="0" w:after="0" w:line="276" w:lineRule="auto"/>
+            </w:pPr>
+            <w:hyperlink r:id="rId38">
+              <w:r>
+                <w:rPr>
+                  <w:rFonts w:ascii="Arial" w:hAnsi="Arial"/>
+                  <w:color w:val="1155CC"/>
+                  <w:u w:val="single"/>
+                </w:rPr>
+                <w:t>PR #717</w:t>
+              </w:r>
+            </w:hyperlink>
+            <w:r>
+              <w:rPr>
+                <w:rFonts w:ascii="Arial" w:hAnsi="Arial" w:eastAsia="Arial"/>
+                <w:color w:val="000000"/>
+                <w:sz w:val="20"/>
+              </w:rPr>
+              <w:t xml:space="preserve">, commit </w:t>
+            </w:r>
+            <w:r>
+              <w:rPr>
+                <w:rFonts w:ascii="Courier New" w:hAnsi="Courier New" w:eastAsia="Courier New"/>
+                <w:color w:val="000000"/>
+                <w:sz w:val="19"/>
+              </w:rPr>
+              <w:t>7b85130</w:t>
+            </w:r>
+            <w:r>
+              <w:rPr>
+                <w:rFonts w:ascii="Arial" w:hAnsi="Arial" w:eastAsia="Arial"/>
+                <w:color w:val="000000"/>
+                <w:sz w:val="20"/>
+              </w:rPr>
+              <w:t>. The repaired report remains High because runtime coverage was not supplied; token validity and scope are deliberately not modeled.</w:t>
+            </w:r>
+          </w:p>
+        </w:tc>
+      </w:tr>
+      <w:tr>
+        <w:tc>
+          <w:tcPr>
+            <w:tcW w:type="dxa" w:w="7200"/>
+            <w:gridSpan w:val="2"/>
+            <w:vAlign w:val="center"/>
+          </w:tcPr>
+          <w:p>
+            <w:pPr>
+              <w:keepNext/>
+              <w:spacing w:before="0" w:after="0" w:line="276" w:lineRule="auto"/>
+            </w:pPr>
+            <w:r>
+              <w:rPr>
+                <w:rFonts w:ascii="Arial" w:hAnsi="Arial" w:eastAsia="Arial"/>
+                <w:b/>
+                <w:color w:val="000000"/>
+                <w:sz w:val="20"/>
+              </w:rPr>
+              <w:t>Entry 10 — 27 Jul 2026</w:t>
+            </w:r>
+          </w:p>
+        </w:tc>
+      </w:tr>
+      <w:tr>
+        <w:tc>
+          <w:tcPr>
+            <w:tcW w:type="dxa" w:w="2160"/>
+            <w:vAlign w:val="center"/>
+          </w:tcPr>
+          <w:p>
+            <w:pPr>
+              <w:spacing w:before="0" w:after="0" w:line="276" w:lineRule="auto"/>
+            </w:pPr>
+            <w:r>
+              <w:rPr>
+                <w:rFonts w:ascii="Arial" w:hAnsi="Arial" w:eastAsia="Arial"/>
+                <w:b/>
+                <w:color w:val="000000"/>
+                <w:sz w:val="20"/>
+              </w:rPr>
+              <w:t>Issue/task and foundation boundary</w:t>
+            </w:r>
+          </w:p>
+        </w:tc>
+        <w:tc>
+          <w:tcPr>
+            <w:tcW w:type="dxa" w:w="7200"/>
+            <w:vAlign w:val="center"/>
+          </w:tcPr>
+          <w:p>
+            <w:pPr>
+              <w:spacing w:before="0" w:after="0" w:line="276" w:lineRule="auto"/>
+            </w:pPr>
+            <w:hyperlink r:id="rId16">
               <w:r>
                 <w:rPr>
                   <w:rFonts w:ascii="Arial" w:hAnsi="Arial"/>
@@ -3641,7 +4869,7 @@
               </w:rPr>
               <w:t xml:space="preserve">, </w:t>
             </w:r>
-            <w:hyperlink r:id="rId16">
+            <w:hyperlink r:id="rId18">
               <w:r>
                 <w:rPr>
                   <w:rFonts w:ascii="Arial" w:hAnsi="Arial"/>
@@ -3659,7 +4887,7 @@
               </w:rPr>
               <w:t xml:space="preserve">, </w:t>
             </w:r>
-            <w:hyperlink r:id="rId15">
+            <w:hyperlink r:id="rId17">
               <w:r>
                 <w:rPr>
                   <w:rFonts w:ascii="Arial" w:hAnsi="Arial"/>
@@ -3677,7 +4905,7 @@
               </w:rPr>
               <w:t xml:space="preserve">, </w:t>
             </w:r>
-            <w:hyperlink r:id="rId17">
+            <w:hyperlink r:id="rId19">
               <w:r>
                 <w:rPr>
                   <w:rFonts w:ascii="Arial" w:hAnsi="Arial"/>
@@ -3988,7 +5216,7 @@
           <w:numId w:val="23"/>
         </w:numPr>
       </w:pPr>
-      <w:hyperlink r:id="rId19">
+      <w:hyperlink r:id="rId21">
         <w:r>
           <w:rPr>
             <w:rFonts w:ascii="Arial" w:hAnsi="Arial"/>
@@ -4010,7 +5238,7 @@
           <w:numId w:val="23"/>
         </w:numPr>
       </w:pPr>
-      <w:hyperlink r:id="rId20">
+      <w:hyperlink r:id="rId22">
         <w:r>
           <w:rPr>
             <w:rFonts w:ascii="Arial" w:hAnsi="Arial"/>
@@ -4032,7 +5260,7 @@
           <w:numId w:val="23"/>
         </w:numPr>
       </w:pPr>
-      <w:hyperlink r:id="rId16">
+      <w:hyperlink r:id="rId18">
         <w:r>
           <w:rPr>
             <w:rFonts w:ascii="Arial" w:hAnsi="Arial"/>
@@ -4054,7 +5282,7 @@
           <w:numId w:val="23"/>
         </w:numPr>
       </w:pPr>
-      <w:hyperlink r:id="rId15">
+      <w:hyperlink r:id="rId17">
         <w:r>
           <w:rPr>
             <w:rFonts w:ascii="Arial" w:hAnsi="Arial"/>
@@ -4076,7 +5304,7 @@
           <w:numId w:val="23"/>
         </w:numPr>
       </w:pPr>
-      <w:hyperlink r:id="rId17">
+      <w:hyperlink r:id="rId19">
         <w:r>
           <w:rPr>
             <w:rFonts w:ascii="Arial" w:hAnsi="Arial"/>

</xml_diff>

<commit_message>
release: freeze CodeDecay v0.4.0 hackathon build (#718)
* release: prepare v0.4.0 hackathon build

* test(judge-lab): satisfy release lint gate
</commit_message>
<xml_diff>
--- a/docs/hackathon/codedecay-submission.docx
+++ b/docs/hackathon/codedecay-submission.docx
@@ -98,7 +98,7 @@
         <w:rPr>
           <w:b/>
         </w:rPr>
-        <w:t>Source:</w:t>
+        <w:t>Three-minute demo:</w:t>
       </w:r>
       <w:r>
         <w:t xml:space="preserve"> </w:t>
@@ -110,7 +110,7 @@
             <w:color w:val="1155CC"/>
             <w:u w:val="single"/>
           </w:rPr>
-          <w:t>View the public repository</w:t>
+          <w:t>Watch the captioned Codex repair</w:t>
         </w:r>
       </w:hyperlink>
     </w:p>
@@ -126,7 +126,7 @@
         <w:rPr>
           <w:b/>
         </w:rPr>
-        <w:t>Current public package:</w:t>
+        <w:t>Source:</w:t>
       </w:r>
       <w:r>
         <w:t xml:space="preserve"> </w:t>
@@ -138,7 +138,7 @@
             <w:color w:val="1155CC"/>
             <w:u w:val="single"/>
           </w:rPr>
-          <w:t>View the npm package</w:t>
+          <w:t>View the public repository</w:t>
         </w:r>
       </w:hyperlink>
     </w:p>
@@ -154,7 +154,7 @@
         <w:rPr>
           <w:b/>
         </w:rPr>
-        <w:t>Current public release:</w:t>
+        <w:t>Current public package:</w:t>
       </w:r>
       <w:r>
         <w:t xml:space="preserve"> </w:t>
@@ -166,7 +166,7 @@
             <w:color w:val="1155CC"/>
             <w:u w:val="single"/>
           </w:rPr>
-          <w:t>View v0.3.5</w:t>
+          <w:t>View the npm package</w:t>
         </w:r>
       </w:hyperlink>
     </w:p>
@@ -182,7 +182,7 @@
         <w:rPr>
           <w:b/>
         </w:rPr>
-        <w:t>Benchmark method and limitations:</w:t>
+        <w:t>Hackathon release:</w:t>
       </w:r>
       <w:r>
         <w:t xml:space="preserve"> </w:t>
@@ -194,6 +194,62 @@
             <w:color w:val="1155CC"/>
             <w:u w:val="single"/>
           </w:rPr>
+          <w:t>View v0.4.0</w:t>
+        </w:r>
+      </w:hyperlink>
+    </w:p>
+    <w:p>
+      <w:pPr>
+        <w:pStyle w:val="CodeDecayListBullet"/>
+        <w:numPr>
+          <w:ilvl w:val="0"/>
+          <w:numId w:val="10"/>
+        </w:numPr>
+      </w:pPr>
+      <w:r>
+        <w:rPr>
+          <w:b/>
+        </w:rPr>
+        <w:t>Release notes:</w:t>
+      </w:r>
+      <w:r>
+        <w:t xml:space="preserve"> </w:t>
+      </w:r>
+      <w:hyperlink r:id="rId14">
+        <w:r>
+          <w:rPr>
+            <w:rFonts w:ascii="Arial" w:hAnsi="Arial"/>
+            <w:color w:val="1155CC"/>
+            <w:u w:val="single"/>
+          </w:rPr>
+          <w:t>Read the shipped behavior and limitations</w:t>
+        </w:r>
+      </w:hyperlink>
+    </w:p>
+    <w:p>
+      <w:pPr>
+        <w:pStyle w:val="CodeDecayListBullet"/>
+        <w:numPr>
+          <w:ilvl w:val="0"/>
+          <w:numId w:val="10"/>
+        </w:numPr>
+      </w:pPr>
+      <w:r>
+        <w:rPr>
+          <w:b/>
+        </w:rPr>
+        <w:t>Benchmark method and limitations:</w:t>
+      </w:r>
+      <w:r>
+        <w:t xml:space="preserve"> </w:t>
+      </w:r>
+      <w:hyperlink r:id="rId15">
+        <w:r>
+          <w:rPr>
+            <w:rFonts w:ascii="Arial" w:hAnsi="Arial"/>
+            <w:color w:val="1155CC"/>
+            <w:u w:val="single"/>
+          </w:rPr>
           <w:t>Read the benchmark corpus documentation</w:t>
         </w:r>
       </w:hyperlink>
@@ -215,7 +271,7 @@
       <w:r>
         <w:t xml:space="preserve"> </w:t>
       </w:r>
-      <w:hyperlink r:id="rId14">
+      <w:hyperlink r:id="rId16">
         <w:r>
           <w:rPr>
             <w:rFonts w:ascii="Arial" w:hAnsi="Arial"/>
@@ -230,7 +286,7 @@
       <w:r>
         <w:t xml:space="preserve">The immutable hackathon release, public video, public Google Doc URL, and final BlockseBlock confirmation are release gates tracked in </w:t>
       </w:r>
-      <w:hyperlink r:id="rId15">
+      <w:hyperlink r:id="rId17">
         <w:r>
           <w:rPr>
             <w:rFonts w:ascii="Arial" w:hAnsi="Arial"/>
@@ -243,7 +299,7 @@
       <w:r>
         <w:t xml:space="preserve">, </w:t>
       </w:r>
-      <w:hyperlink r:id="rId16">
+      <w:hyperlink r:id="rId18">
         <w:r>
           <w:rPr>
             <w:rFonts w:ascii="Arial" w:hAnsi="Arial"/>
@@ -256,7 +312,7 @@
       <w:r>
         <w:t xml:space="preserve">, and </w:t>
       </w:r>
-      <w:hyperlink r:id="rId17">
+      <w:hyperlink r:id="rId19">
         <w:r>
           <w:rPr>
             <w:rFonts w:ascii="Arial" w:hAnsi="Arial"/>
@@ -855,7 +911,7 @@
         </w:numPr>
       </w:pPr>
       <w:r>
-        <w:t>it built, tested, deployed, and anonymously smoke-tested the Judge Lab;</w:t>
+        <w:t>it built, tested, and anonymously smoke-tested the Judge Lab;</w:t>
       </w:r>
     </w:p>
     <w:p>
@@ -880,6 +936,54 @@
       </w:pPr>
       <w:r>
         <w:t>it found and fixed a clean-checkout CI dependency gap;</w:t>
+      </w:r>
+    </w:p>
+    <w:p>
+      <w:pPr>
+        <w:pStyle w:val="CodeDecayListBullet"/>
+        <w:numPr>
+          <w:ilvl w:val="0"/>
+          <w:numId w:val="14"/>
+        </w:numPr>
+      </w:pPr>
+      <w:r>
+        <w:t>it found and fixed contradictory task-bundle safety notes after real checks had executed;</w:t>
+      </w:r>
+    </w:p>
+    <w:p>
+      <w:pPr>
+        <w:pStyle w:val="CodeDecayListBullet"/>
+        <w:numPr>
+          <w:ilvl w:val="0"/>
+          <w:numId w:val="14"/>
+        </w:numPr>
+      </w:pPr>
+      <w:r>
+        <w:t>it replaced generic edge-case lists with ranked, behavior-specific scenarios grounded in changed routes, symbols, flows, requirements, memory, and proof;</w:t>
+      </w:r>
+    </w:p>
+    <w:p>
+      <w:pPr>
+        <w:pStyle w:val="CodeDecayListBullet"/>
+        <w:numPr>
+          <w:ilvl w:val="0"/>
+          <w:numId w:val="14"/>
+        </w:numPr>
+      </w:pPr>
+      <w:r>
+        <w:t>it cleared the release dependency advisories and proved the packed CLI does not install the bundled MCP server's HTTP dependency graph;</w:t>
+      </w:r>
+    </w:p>
+    <w:p>
+      <w:pPr>
+        <w:pStyle w:val="CodeDecayListBullet"/>
+        <w:numPr>
+          <w:ilvl w:val="0"/>
+          <w:numId w:val="14"/>
+        </w:numPr>
+      </w:pPr>
+      <w:r>
+        <w:t>it recorded a genuine Codex repair session with red-before-green endpoint proof, captions, a sanitized transcript, exact commands, and an honest post-repair limitation;</w:t>
       </w:r>
     </w:p>
     <w:p>
@@ -910,7 +1014,7 @@
       <w:r>
         <w:t xml:space="preserve">The public evidence ledger records the issue, components, checks, decisions, commit or pull request, and remaining limitation for each contribution: </w:t>
       </w:r>
-      <w:hyperlink r:id="rId18">
+      <w:hyperlink r:id="rId20">
         <w:r>
           <w:rPr>
             <w:rFonts w:ascii="Arial" w:hAnsi="Arial"/>
@@ -1295,7 +1399,7 @@
       <w:r>
         <w:t xml:space="preserve">These are deterministic fixture-corpus results, not production accuracy. The false positives are intentionally visible. The larger paired real-agent outcome benchmark in </w:t>
       </w:r>
-      <w:hyperlink r:id="rId19">
+      <w:hyperlink r:id="rId21">
         <w:r>
           <w:rPr>
             <w:rFonts w:ascii="Arial" w:hAnsi="Arial"/>
@@ -1517,7 +1621,7 @@
         </w:numPr>
       </w:pPr>
       <w:r>
-        <w:t>public credential-free Judge Lab;</w:t>
+        <w:t>behavior-specific edge-case ranking and overflow evidence;</w:t>
       </w:r>
     </w:p>
     <w:p>
@@ -1529,7 +1633,55 @@
         </w:numPr>
       </w:pPr>
       <w:r>
+        <w:t>truthful agent-task safety limits after configured execution;</w:t>
+      </w:r>
+    </w:p>
+    <w:p>
+      <w:pPr>
+        <w:pStyle w:val="CodeDecayListBullet"/>
+        <w:numPr>
+          <w:ilvl w:val="0"/>
+          <w:numId w:val="19"/>
+        </w:numPr>
+      </w:pPr>
+      <w:r>
+        <w:t>a zero-advisory packed CLI dependency boundary;</w:t>
+      </w:r>
+    </w:p>
+    <w:p>
+      <w:pPr>
+        <w:pStyle w:val="CodeDecayListBullet"/>
+        <w:numPr>
+          <w:ilvl w:val="0"/>
+          <w:numId w:val="19"/>
+        </w:numPr>
+      </w:pPr>
+      <w:r>
+        <w:t>public credential-free Judge Lab;</w:t>
+      </w:r>
+    </w:p>
+    <w:p>
+      <w:pPr>
+        <w:pStyle w:val="CodeDecayListBullet"/>
+        <w:numPr>
+          <w:ilvl w:val="0"/>
+          <w:numId w:val="19"/>
+        </w:numPr>
+      </w:pPr>
+      <w:r>
         <w:t>reproducible weak-test evidence and production acceptance;</w:t>
+      </w:r>
+    </w:p>
+    <w:p>
+      <w:pPr>
+        <w:pStyle w:val="CodeDecayListBullet"/>
+        <w:numPr>
+          <w:ilvl w:val="0"/>
+          <w:numId w:val="19"/>
+        </w:numPr>
+      </w:pPr>
+      <w:r>
+        <w:t>a genuine, reproducible three-minute Codex repair demo;</w:t>
       </w:r>
     </w:p>
     <w:p>
@@ -1652,7 +1804,7 @@
       <w:r>
         <w:t xml:space="preserve">independent three-participant published-workflow UAT in </w:t>
       </w:r>
-      <w:hyperlink r:id="rId20">
+      <w:hyperlink r:id="rId22">
         <w:r>
           <w:rPr>
             <w:rFonts w:ascii="Arial" w:hAnsi="Arial"/>
@@ -1884,7 +2036,7 @@
       <w:r>
         <w:t xml:space="preserve">Published-package proof and the immutable tag, package integrity, release URL, and final source SHA are produced by </w:t>
       </w:r>
-      <w:hyperlink r:id="rId15">
+      <w:hyperlink r:id="rId17">
         <w:r>
           <w:rPr>
             <w:rFonts w:ascii="Arial" w:hAnsi="Arial"/>
@@ -2208,7 +2360,7 @@
             <w:pPr>
               <w:spacing w:before="0" w:after="0" w:line="276" w:lineRule="auto"/>
             </w:pPr>
-            <w:hyperlink r:id="rId21">
+            <w:hyperlink r:id="rId23">
               <w:r>
                 <w:rPr>
                   <w:rFonts w:ascii="Arial" w:hAnsi="Arial"/>
@@ -2398,7 +2550,7 @@
             <w:pPr>
               <w:spacing w:before="0" w:after="0" w:line="276" w:lineRule="auto"/>
             </w:pPr>
-            <w:hyperlink r:id="rId22">
+            <w:hyperlink r:id="rId24">
               <w:r>
                 <w:rPr>
                   <w:rFonts w:ascii="Arial" w:hAnsi="Arial"/>
@@ -2489,7 +2641,7 @@
             <w:pPr>
               <w:spacing w:before="0" w:after="0" w:line="276" w:lineRule="auto"/>
             </w:pPr>
-            <w:hyperlink r:id="rId23">
+            <w:hyperlink r:id="rId25">
               <w:r>
                 <w:rPr>
                   <w:rFonts w:ascii="Arial" w:hAnsi="Arial"/>
@@ -2679,7 +2831,7 @@
             <w:pPr>
               <w:spacing w:before="0" w:after="0" w:line="276" w:lineRule="auto"/>
             </w:pPr>
-            <w:hyperlink r:id="rId24">
+            <w:hyperlink r:id="rId26">
               <w:r>
                 <w:rPr>
                   <w:rFonts w:ascii="Arial" w:hAnsi="Arial"/>
@@ -2770,7 +2922,7 @@
             <w:pPr>
               <w:spacing w:before="0" w:after="0" w:line="276" w:lineRule="auto"/>
             </w:pPr>
-            <w:hyperlink r:id="rId25">
+            <w:hyperlink r:id="rId27">
               <w:r>
                 <w:rPr>
                   <w:rFonts w:ascii="Arial" w:hAnsi="Arial"/>
@@ -2976,7 +3128,7 @@
             <w:pPr>
               <w:spacing w:before="0" w:after="0" w:line="276" w:lineRule="auto"/>
             </w:pPr>
-            <w:hyperlink r:id="rId26">
+            <w:hyperlink r:id="rId28">
               <w:r>
                 <w:rPr>
                   <w:rFonts w:ascii="Arial" w:hAnsi="Arial"/>
@@ -3067,7 +3219,7 @@
             <w:pPr>
               <w:spacing w:before="0" w:after="0" w:line="276" w:lineRule="auto"/>
             </w:pPr>
-            <w:hyperlink r:id="rId27">
+            <w:hyperlink r:id="rId29">
               <w:r>
                 <w:rPr>
                   <w:rFonts w:ascii="Arial" w:hAnsi="Arial"/>
@@ -3241,7 +3393,7 @@
             <w:pPr>
               <w:spacing w:before="0" w:after="0" w:line="276" w:lineRule="auto"/>
             </w:pPr>
-            <w:hyperlink r:id="rId28">
+            <w:hyperlink r:id="rId30">
               <w:r>
                 <w:rPr>
                   <w:rFonts w:ascii="Arial" w:hAnsi="Arial"/>
@@ -3332,7 +3484,7 @@
             <w:pPr>
               <w:spacing w:before="0" w:after="0" w:line="276" w:lineRule="auto"/>
             </w:pPr>
-            <w:hyperlink r:id="rId29">
+            <w:hyperlink r:id="rId31">
               <w:r>
                 <w:rPr>
                   <w:rFonts w:ascii="Arial" w:hAnsi="Arial"/>
@@ -3514,7 +3666,7 @@
             <w:pPr>
               <w:spacing w:before="0" w:after="0" w:line="276" w:lineRule="auto"/>
             </w:pPr>
-            <w:hyperlink r:id="rId30">
+            <w:hyperlink r:id="rId32">
               <w:r>
                 <w:rPr>
                   <w:rFonts w:ascii="Arial" w:hAnsi="Arial"/>
@@ -3588,7 +3740,7 @@
                 <w:color w:val="000000"/>
                 <w:sz w:val="20"/>
               </w:rPr>
-              <w:t>Entry 6 — 27 Jul 2026</w:t>
+              <w:t>Entry 6 — 27 Jul 2026, 19:26</w:t>
             </w:r>
           </w:p>
         </w:tc>
@@ -3623,7 +3775,1083 @@
             <w:pPr>
               <w:spacing w:before="0" w:after="0" w:line="276" w:lineRule="auto"/>
             </w:pPr>
-            <w:hyperlink r:id="rId14">
+            <w:hyperlink r:id="rId33">
+              <w:r>
+                <w:rPr>
+                  <w:rFonts w:ascii="Arial" w:hAnsi="Arial"/>
+                  <w:color w:val="1155CC"/>
+                  <w:u w:val="single"/>
+                </w:rPr>
+                <w:t>#709</w:t>
+              </w:r>
+            </w:hyperlink>
+            <w:r>
+              <w:rPr>
+                <w:rFonts w:ascii="Arial" w:hAnsi="Arial" w:eastAsia="Arial"/>
+                <w:color w:val="000000"/>
+                <w:sz w:val="20"/>
+              </w:rPr>
+              <w:t>: agent bundles and configured execution already existed; dogfooding exposed a contradiction between executed checks and an unconditional no-command limit.</w:t>
+            </w:r>
+          </w:p>
+        </w:tc>
+      </w:tr>
+      <w:tr>
+        <w:tc>
+          <w:tcPr>
+            <w:tcW w:type="dxa" w:w="2160"/>
+            <w:vAlign w:val="center"/>
+          </w:tcPr>
+          <w:p>
+            <w:pPr>
+              <w:spacing w:before="0" w:after="0" w:line="276" w:lineRule="auto"/>
+            </w:pPr>
+            <w:r>
+              <w:rPr>
+                <w:rFonts w:ascii="Arial" w:hAnsi="Arial" w:eastAsia="Arial"/>
+                <w:b/>
+                <w:color w:val="000000"/>
+                <w:sz w:val="20"/>
+              </w:rPr>
+              <w:t>Codex surface and public planning evidence</w:t>
+            </w:r>
+          </w:p>
+        </w:tc>
+        <w:tc>
+          <w:tcPr>
+            <w:tcW w:type="dxa" w:w="7200"/>
+            <w:vAlign w:val="center"/>
+          </w:tcPr>
+          <w:p>
+            <w:pPr>
+              <w:spacing w:before="0" w:after="0" w:line="276" w:lineRule="auto"/>
+            </w:pPr>
+            <w:r>
+              <w:rPr>
+                <w:rFonts w:ascii="Arial" w:hAnsi="Arial" w:eastAsia="Arial"/>
+                <w:color w:val="000000"/>
+                <w:sz w:val="20"/>
+              </w:rPr>
+              <w:t xml:space="preserve">Codex traced the public </w:t>
+            </w:r>
+            <w:r>
+              <w:rPr>
+                <w:rFonts w:ascii="Courier New" w:hAnsi="Courier New" w:eastAsia="Courier New"/>
+                <w:color w:val="000000"/>
+                <w:sz w:val="19"/>
+              </w:rPr>
+              <w:t>codedecay ai --with-checks</w:t>
+            </w:r>
+            <w:r>
+              <w:rPr>
+                <w:rFonts w:ascii="Arial" w:hAnsi="Arial" w:eastAsia="Arial"/>
+                <w:color w:val="000000"/>
+                <w:sz w:val="20"/>
+              </w:rPr>
+              <w:t xml:space="preserve"> path, corrected the evidence-derived limit, and added JSON plus rendered Markdown regression proof.</w:t>
+            </w:r>
+          </w:p>
+        </w:tc>
+      </w:tr>
+      <w:tr>
+        <w:tc>
+          <w:tcPr>
+            <w:tcW w:type="dxa" w:w="2160"/>
+            <w:vAlign w:val="center"/>
+          </w:tcPr>
+          <w:p>
+            <w:pPr>
+              <w:spacing w:before="0" w:after="0" w:line="276" w:lineRule="auto"/>
+            </w:pPr>
+            <w:r>
+              <w:rPr>
+                <w:rFonts w:ascii="Arial" w:hAnsi="Arial" w:eastAsia="Arial"/>
+                <w:b/>
+                <w:color w:val="000000"/>
+                <w:sz w:val="20"/>
+              </w:rPr>
+              <w:t>Files/components changed</w:t>
+            </w:r>
+          </w:p>
+        </w:tc>
+        <w:tc>
+          <w:tcPr>
+            <w:tcW w:type="dxa" w:w="7200"/>
+            <w:vAlign w:val="center"/>
+          </w:tcPr>
+          <w:p>
+            <w:pPr>
+              <w:spacing w:before="0" w:after="0" w:line="276" w:lineRule="auto"/>
+            </w:pPr>
+            <w:r>
+              <w:rPr>
+                <w:rFonts w:ascii="Arial" w:hAnsi="Arial" w:eastAsia="Arial"/>
+                <w:color w:val="000000"/>
+                <w:sz w:val="20"/>
+              </w:rPr>
+              <w:t>Agent task-bundle safety limits and AI workflow tests.</w:t>
+            </w:r>
+          </w:p>
+        </w:tc>
+      </w:tr>
+      <w:tr>
+        <w:tc>
+          <w:tcPr>
+            <w:tcW w:type="dxa" w:w="2160"/>
+            <w:vAlign w:val="center"/>
+          </w:tcPr>
+          <w:p>
+            <w:pPr>
+              <w:spacing w:before="0" w:after="0" w:line="276" w:lineRule="auto"/>
+            </w:pPr>
+            <w:r>
+              <w:rPr>
+                <w:rFonts w:ascii="Arial" w:hAnsi="Arial" w:eastAsia="Arial"/>
+                <w:b/>
+                <w:color w:val="000000"/>
+                <w:sz w:val="20"/>
+              </w:rPr>
+              <w:t>Commands and tests executed</w:t>
+            </w:r>
+          </w:p>
+        </w:tc>
+        <w:tc>
+          <w:tcPr>
+            <w:tcW w:type="dxa" w:w="7200"/>
+            <w:vAlign w:val="center"/>
+          </w:tcPr>
+          <w:p>
+            <w:pPr>
+              <w:spacing w:before="0" w:after="0" w:line="276" w:lineRule="auto"/>
+            </w:pPr>
+            <w:r>
+              <w:rPr>
+                <w:rFonts w:ascii="Arial" w:hAnsi="Arial" w:eastAsia="Arial"/>
+                <w:color w:val="000000"/>
+                <w:sz w:val="20"/>
+              </w:rPr>
+              <w:t>Focused agent/AI tests, full suite, lint, typecheck, build, package dry-run, GitHub checks.</w:t>
+            </w:r>
+          </w:p>
+        </w:tc>
+      </w:tr>
+      <w:tr>
+        <w:tc>
+          <w:tcPr>
+            <w:tcW w:type="dxa" w:w="2160"/>
+            <w:vAlign w:val="center"/>
+          </w:tcPr>
+          <w:p>
+            <w:pPr>
+              <w:spacing w:before="0" w:after="0" w:line="276" w:lineRule="auto"/>
+            </w:pPr>
+            <w:r>
+              <w:rPr>
+                <w:rFonts w:ascii="Arial" w:hAnsi="Arial" w:eastAsia="Arial"/>
+                <w:b/>
+                <w:color w:val="000000"/>
+                <w:sz w:val="20"/>
+              </w:rPr>
+              <w:t>Human decision, public result, and remaining limitation</w:t>
+            </w:r>
+          </w:p>
+        </w:tc>
+        <w:tc>
+          <w:tcPr>
+            <w:tcW w:type="dxa" w:w="7200"/>
+            <w:vAlign w:val="center"/>
+          </w:tcPr>
+          <w:p>
+            <w:pPr>
+              <w:spacing w:before="0" w:after="0" w:line="276" w:lineRule="auto"/>
+            </w:pPr>
+            <w:hyperlink r:id="rId34">
+              <w:r>
+                <w:rPr>
+                  <w:rFonts w:ascii="Arial" w:hAnsi="Arial"/>
+                  <w:color w:val="1155CC"/>
+                  <w:u w:val="single"/>
+                </w:rPr>
+                <w:t>PR #711</w:t>
+              </w:r>
+            </w:hyperlink>
+            <w:r>
+              <w:rPr>
+                <w:rFonts w:ascii="Arial" w:hAnsi="Arial" w:eastAsia="Arial"/>
+                <w:color w:val="000000"/>
+                <w:sz w:val="20"/>
+              </w:rPr>
+              <w:t xml:space="preserve">, commit </w:t>
+            </w:r>
+            <w:r>
+              <w:rPr>
+                <w:rFonts w:ascii="Courier New" w:hAnsi="Courier New" w:eastAsia="Courier New"/>
+                <w:color w:val="000000"/>
+                <w:sz w:val="19"/>
+              </w:rPr>
+              <w:t>06a6dae</w:t>
+            </w:r>
+            <w:r>
+              <w:rPr>
+                <w:rFonts w:ascii="Arial" w:hAnsi="Arial" w:eastAsia="Arial"/>
+                <w:color w:val="000000"/>
+                <w:sz w:val="20"/>
+              </w:rPr>
+              <w:t>. Limitation: the bundle reports configured execution state; it does not infer unobserved external actions.</w:t>
+            </w:r>
+          </w:p>
+        </w:tc>
+      </w:tr>
+      <w:tr>
+        <w:tc>
+          <w:tcPr>
+            <w:tcW w:type="dxa" w:w="7200"/>
+            <w:gridSpan w:val="2"/>
+            <w:vAlign w:val="center"/>
+          </w:tcPr>
+          <w:p>
+            <w:pPr>
+              <w:keepNext/>
+              <w:spacing w:before="0" w:after="0" w:line="276" w:lineRule="auto"/>
+            </w:pPr>
+            <w:r>
+              <w:rPr>
+                <w:rFonts w:ascii="Arial" w:hAnsi="Arial" w:eastAsia="Arial"/>
+                <w:b/>
+                <w:color w:val="000000"/>
+                <w:sz w:val="20"/>
+              </w:rPr>
+              <w:t>Entry 7 — 27 Jul 2026, 19:41</w:t>
+            </w:r>
+          </w:p>
+        </w:tc>
+      </w:tr>
+      <w:tr>
+        <w:tc>
+          <w:tcPr>
+            <w:tcW w:type="dxa" w:w="2160"/>
+            <w:vAlign w:val="center"/>
+          </w:tcPr>
+          <w:p>
+            <w:pPr>
+              <w:spacing w:before="0" w:after="0" w:line="276" w:lineRule="auto"/>
+            </w:pPr>
+            <w:r>
+              <w:rPr>
+                <w:rFonts w:ascii="Arial" w:hAnsi="Arial" w:eastAsia="Arial"/>
+                <w:b/>
+                <w:color w:val="000000"/>
+                <w:sz w:val="20"/>
+              </w:rPr>
+              <w:t>Issue/task and foundation boundary</w:t>
+            </w:r>
+          </w:p>
+        </w:tc>
+        <w:tc>
+          <w:tcPr>
+            <w:tcW w:type="dxa" w:w="7200"/>
+            <w:vAlign w:val="center"/>
+          </w:tcPr>
+          <w:p>
+            <w:pPr>
+              <w:spacing w:before="0" w:after="0" w:line="276" w:lineRule="auto"/>
+            </w:pPr>
+            <w:hyperlink r:id="rId35">
+              <w:r>
+                <w:rPr>
+                  <w:rFonts w:ascii="Arial" w:hAnsi="Arial"/>
+                  <w:color w:val="1155CC"/>
+                  <w:u w:val="single"/>
+                </w:rPr>
+                <w:t>#710</w:t>
+              </w:r>
+            </w:hyperlink>
+            <w:r>
+              <w:rPr>
+                <w:rFonts w:ascii="Arial" w:hAnsi="Arial" w:eastAsia="Arial"/>
+                <w:color w:val="000000"/>
+                <w:sz w:val="20"/>
+              </w:rPr>
+              <w:t>: the CLI and MCP server were already shipped; the release audit found transitive dependency advisories and an unnecessarily installed server graph.</w:t>
+            </w:r>
+          </w:p>
+        </w:tc>
+      </w:tr>
+      <w:tr>
+        <w:tc>
+          <w:tcPr>
+            <w:tcW w:type="dxa" w:w="2160"/>
+            <w:vAlign w:val="center"/>
+          </w:tcPr>
+          <w:p>
+            <w:pPr>
+              <w:spacing w:before="0" w:after="0" w:line="276" w:lineRule="auto"/>
+            </w:pPr>
+            <w:r>
+              <w:rPr>
+                <w:rFonts w:ascii="Arial" w:hAnsi="Arial" w:eastAsia="Arial"/>
+                <w:b/>
+                <w:color w:val="000000"/>
+                <w:sz w:val="20"/>
+              </w:rPr>
+              <w:t>Codex surface and public planning evidence</w:t>
+            </w:r>
+          </w:p>
+        </w:tc>
+        <w:tc>
+          <w:tcPr>
+            <w:tcW w:type="dxa" w:w="7200"/>
+            <w:vAlign w:val="center"/>
+          </w:tcPr>
+          <w:p>
+            <w:pPr>
+              <w:spacing w:before="0" w:after="0" w:line="276" w:lineRule="auto"/>
+            </w:pPr>
+            <w:r>
+              <w:rPr>
+                <w:rFonts w:ascii="Arial" w:hAnsi="Arial" w:eastAsia="Arial"/>
+                <w:color w:val="000000"/>
+                <w:sz w:val="20"/>
+              </w:rPr>
+              <w:t>Codex inspected the dependency paths, raised patched floors, bundled the MCP server surface, and added a fresh packed-consumer proof.</w:t>
+            </w:r>
+          </w:p>
+        </w:tc>
+      </w:tr>
+      <w:tr>
+        <w:tc>
+          <w:tcPr>
+            <w:tcW w:type="dxa" w:w="2160"/>
+            <w:vAlign w:val="center"/>
+          </w:tcPr>
+          <w:p>
+            <w:pPr>
+              <w:spacing w:before="0" w:after="0" w:line="276" w:lineRule="auto"/>
+            </w:pPr>
+            <w:r>
+              <w:rPr>
+                <w:rFonts w:ascii="Arial" w:hAnsi="Arial" w:eastAsia="Arial"/>
+                <w:b/>
+                <w:color w:val="000000"/>
+                <w:sz w:val="20"/>
+              </w:rPr>
+              <w:t>Files/components changed</w:t>
+            </w:r>
+          </w:p>
+        </w:tc>
+        <w:tc>
+          <w:tcPr>
+            <w:tcW w:type="dxa" w:w="7200"/>
+            <w:vAlign w:val="center"/>
+          </w:tcPr>
+          <w:p>
+            <w:pPr>
+              <w:spacing w:before="0" w:after="0" w:line="276" w:lineRule="auto"/>
+            </w:pPr>
+            <w:r>
+              <w:rPr>
+                <w:rFonts w:ascii="Arial" w:hAnsi="Arial" w:eastAsia="Arial"/>
+                <w:color w:val="000000"/>
+                <w:sz w:val="20"/>
+              </w:rPr>
+              <w:t>Lockfile policy, dependency resolutions, CLI bundling, packed MCP smoke.</w:t>
+            </w:r>
+          </w:p>
+        </w:tc>
+      </w:tr>
+      <w:tr>
+        <w:tc>
+          <w:tcPr>
+            <w:tcW w:type="dxa" w:w="2160"/>
+            <w:vAlign w:val="center"/>
+          </w:tcPr>
+          <w:p>
+            <w:pPr>
+              <w:spacing w:before="0" w:after="0" w:line="276" w:lineRule="auto"/>
+            </w:pPr>
+            <w:r>
+              <w:rPr>
+                <w:rFonts w:ascii="Arial" w:hAnsi="Arial" w:eastAsia="Arial"/>
+                <w:b/>
+                <w:color w:val="000000"/>
+                <w:sz w:val="20"/>
+              </w:rPr>
+              <w:t>Commands and tests executed</w:t>
+            </w:r>
+          </w:p>
+        </w:tc>
+        <w:tc>
+          <w:tcPr>
+            <w:tcW w:type="dxa" w:w="7200"/>
+            <w:vAlign w:val="center"/>
+          </w:tcPr>
+          <w:p>
+            <w:pPr>
+              <w:spacing w:before="0" w:after="0" w:line="276" w:lineRule="auto"/>
+            </w:pPr>
+            <w:r>
+              <w:rPr>
+                <w:rFonts w:ascii="Arial" w:hAnsi="Arial" w:eastAsia="Arial"/>
+                <w:color w:val="000000"/>
+                <w:sz w:val="20"/>
+              </w:rPr>
+              <w:t>Full suite, audits at moderate and production scopes, build, package dry-run, child-repository E2E, fresh packed install.</w:t>
+            </w:r>
+          </w:p>
+        </w:tc>
+      </w:tr>
+      <w:tr>
+        <w:tc>
+          <w:tcPr>
+            <w:tcW w:type="dxa" w:w="2160"/>
+            <w:vAlign w:val="center"/>
+          </w:tcPr>
+          <w:p>
+            <w:pPr>
+              <w:spacing w:before="0" w:after="0" w:line="276" w:lineRule="auto"/>
+            </w:pPr>
+            <w:r>
+              <w:rPr>
+                <w:rFonts w:ascii="Arial" w:hAnsi="Arial" w:eastAsia="Arial"/>
+                <w:b/>
+                <w:color w:val="000000"/>
+                <w:sz w:val="20"/>
+              </w:rPr>
+              <w:t>Human decision, public result, and remaining limitation</w:t>
+            </w:r>
+          </w:p>
+        </w:tc>
+        <w:tc>
+          <w:tcPr>
+            <w:tcW w:type="dxa" w:w="7200"/>
+            <w:vAlign w:val="center"/>
+          </w:tcPr>
+          <w:p>
+            <w:pPr>
+              <w:spacing w:before="0" w:after="0" w:line="276" w:lineRule="auto"/>
+            </w:pPr>
+            <w:hyperlink r:id="rId36">
+              <w:r>
+                <w:rPr>
+                  <w:rFonts w:ascii="Arial" w:hAnsi="Arial"/>
+                  <w:color w:val="1155CC"/>
+                  <w:u w:val="single"/>
+                </w:rPr>
+                <w:t>PR #714</w:t>
+              </w:r>
+            </w:hyperlink>
+            <w:r>
+              <w:rPr>
+                <w:rFonts w:ascii="Arial" w:hAnsi="Arial" w:eastAsia="Arial"/>
+                <w:color w:val="000000"/>
+                <w:sz w:val="20"/>
+              </w:rPr>
+              <w:t xml:space="preserve">, commit </w:t>
+            </w:r>
+            <w:r>
+              <w:rPr>
+                <w:rFonts w:ascii="Courier New" w:hAnsi="Courier New" w:eastAsia="Courier New"/>
+                <w:color w:val="000000"/>
+                <w:sz w:val="19"/>
+              </w:rPr>
+              <w:t>528a384</w:t>
+            </w:r>
+            <w:r>
+              <w:rPr>
+                <w:rFonts w:ascii="Arial" w:hAnsi="Arial" w:eastAsia="Arial"/>
+                <w:color w:val="000000"/>
+                <w:sz w:val="20"/>
+              </w:rPr>
+              <w:t>. All seven repository alerts closed and production audit reached zero advisories. Limitation: future dependency updates still require recurring audit.</w:t>
+            </w:r>
+          </w:p>
+        </w:tc>
+      </w:tr>
+      <w:tr>
+        <w:tc>
+          <w:tcPr>
+            <w:tcW w:type="dxa" w:w="7200"/>
+            <w:gridSpan w:val="2"/>
+            <w:vAlign w:val="center"/>
+          </w:tcPr>
+          <w:p>
+            <w:pPr>
+              <w:keepNext/>
+              <w:spacing w:before="0" w:after="0" w:line="276" w:lineRule="auto"/>
+            </w:pPr>
+            <w:r>
+              <w:rPr>
+                <w:rFonts w:ascii="Arial" w:hAnsi="Arial" w:eastAsia="Arial"/>
+                <w:b/>
+                <w:color w:val="000000"/>
+                <w:sz w:val="20"/>
+              </w:rPr>
+              <w:t>Entry 8 — 27 Jul 2026, 20:00</w:t>
+            </w:r>
+          </w:p>
+        </w:tc>
+      </w:tr>
+      <w:tr>
+        <w:tc>
+          <w:tcPr>
+            <w:tcW w:type="dxa" w:w="2160"/>
+            <w:vAlign w:val="center"/>
+          </w:tcPr>
+          <w:p>
+            <w:pPr>
+              <w:spacing w:before="0" w:after="0" w:line="276" w:lineRule="auto"/>
+            </w:pPr>
+            <w:r>
+              <w:rPr>
+                <w:rFonts w:ascii="Arial" w:hAnsi="Arial" w:eastAsia="Arial"/>
+                <w:b/>
+                <w:color w:val="000000"/>
+                <w:sz w:val="20"/>
+              </w:rPr>
+              <w:t>Issue/task and foundation boundary</w:t>
+            </w:r>
+          </w:p>
+        </w:tc>
+        <w:tc>
+          <w:tcPr>
+            <w:tcW w:type="dxa" w:w="7200"/>
+            <w:vAlign w:val="center"/>
+          </w:tcPr>
+          <w:p>
+            <w:pPr>
+              <w:spacing w:before="0" w:after="0" w:line="276" w:lineRule="auto"/>
+            </w:pPr>
+            <w:hyperlink r:id="rId29">
+              <w:r>
+                <w:rPr>
+                  <w:rFonts w:ascii="Arial" w:hAnsi="Arial"/>
+                  <w:color w:val="1155CC"/>
+                  <w:u w:val="single"/>
+                </w:rPr>
+                <w:t>#666</w:t>
+              </w:r>
+            </w:hyperlink>
+            <w:r>
+              <w:rPr>
+                <w:rFonts w:ascii="Arial" w:hAnsi="Arial" w:eastAsia="Arial"/>
+                <w:color w:val="000000"/>
+                <w:sz w:val="20"/>
+              </w:rPr>
+              <w:t>: deterministic edge-case generation existed; the completed hackathon work replaced generic checklists with behavior-specific ranked scenarios and explicit overflow.</w:t>
+            </w:r>
+          </w:p>
+        </w:tc>
+      </w:tr>
+      <w:tr>
+        <w:tc>
+          <w:tcPr>
+            <w:tcW w:type="dxa" w:w="2160"/>
+            <w:vAlign w:val="center"/>
+          </w:tcPr>
+          <w:p>
+            <w:pPr>
+              <w:spacing w:before="0" w:after="0" w:line="276" w:lineRule="auto"/>
+            </w:pPr>
+            <w:r>
+              <w:rPr>
+                <w:rFonts w:ascii="Arial" w:hAnsi="Arial" w:eastAsia="Arial"/>
+                <w:b/>
+                <w:color w:val="000000"/>
+                <w:sz w:val="20"/>
+              </w:rPr>
+              <w:t>Codex surface and public planning evidence</w:t>
+            </w:r>
+          </w:p>
+        </w:tc>
+        <w:tc>
+          <w:tcPr>
+            <w:tcW w:type="dxa" w:w="7200"/>
+            <w:vAlign w:val="center"/>
+          </w:tcPr>
+          <w:p>
+            <w:pPr>
+              <w:spacing w:before="0" w:after="0" w:line="276" w:lineRule="auto"/>
+            </w:pPr>
+            <w:r>
+              <w:rPr>
+                <w:rFonts w:ascii="Arial" w:hAnsi="Arial" w:eastAsia="Arial"/>
+                <w:color w:val="000000"/>
+                <w:sz w:val="20"/>
+              </w:rPr>
+              <w:t>Codex compared before/after child-repository output, scoped scenarios to changed routes and symbols, killed deliberate mutants, and separated scenario tasks from proof tasks.</w:t>
+            </w:r>
+          </w:p>
+        </w:tc>
+      </w:tr>
+      <w:tr>
+        <w:tc>
+          <w:tcPr>
+            <w:tcW w:type="dxa" w:w="2160"/>
+            <w:vAlign w:val="center"/>
+          </w:tcPr>
+          <w:p>
+            <w:pPr>
+              <w:spacing w:before="0" w:after="0" w:line="276" w:lineRule="auto"/>
+            </w:pPr>
+            <w:r>
+              <w:rPr>
+                <w:rFonts w:ascii="Arial" w:hAnsi="Arial" w:eastAsia="Arial"/>
+                <w:b/>
+                <w:color w:val="000000"/>
+                <w:sz w:val="20"/>
+              </w:rPr>
+              <w:t>Files/components changed</w:t>
+            </w:r>
+          </w:p>
+        </w:tc>
+        <w:tc>
+          <w:tcPr>
+            <w:tcW w:type="dxa" w:w="7200"/>
+            <w:vAlign w:val="center"/>
+          </w:tcPr>
+          <w:p>
+            <w:pPr>
+              <w:spacing w:before="0" w:after="0" w:line="276" w:lineRule="auto"/>
+            </w:pPr>
+            <w:r>
+              <w:rPr>
+                <w:rFonts w:ascii="Arial" w:hAnsi="Arial" w:eastAsia="Arial"/>
+                <w:color w:val="000000"/>
+                <w:sz w:val="20"/>
+              </w:rPr>
+              <w:t>Red-team scenario model/ranking, JSON/Markdown/MCP/agent output, PR-safety benchmark relevance metrics, docs.</w:t>
+            </w:r>
+          </w:p>
+        </w:tc>
+      </w:tr>
+      <w:tr>
+        <w:tc>
+          <w:tcPr>
+            <w:tcW w:type="dxa" w:w="2160"/>
+            <w:vAlign w:val="center"/>
+          </w:tcPr>
+          <w:p>
+            <w:pPr>
+              <w:spacing w:before="0" w:after="0" w:line="276" w:lineRule="auto"/>
+            </w:pPr>
+            <w:r>
+              <w:rPr>
+                <w:rFonts w:ascii="Arial" w:hAnsi="Arial" w:eastAsia="Arial"/>
+                <w:b/>
+                <w:color w:val="000000"/>
+                <w:sz w:val="20"/>
+              </w:rPr>
+              <w:t>Commands and tests executed</w:t>
+            </w:r>
+          </w:p>
+        </w:tc>
+        <w:tc>
+          <w:tcPr>
+            <w:tcW w:type="dxa" w:w="7200"/>
+            <w:vAlign w:val="center"/>
+          </w:tcPr>
+          <w:p>
+            <w:pPr>
+              <w:spacing w:before="0" w:after="0" w:line="276" w:lineRule="auto"/>
+            </w:pPr>
+            <w:r>
+              <w:rPr>
+                <w:rFonts w:ascii="Arial" w:hAnsi="Arial" w:eastAsia="Arial"/>
+                <w:color w:val="000000"/>
+                <w:sz w:val="20"/>
+              </w:rPr>
+              <w:t>75 focused tests, 665-test full suite, lint, typecheck, build, benchmark, PR-safety eval, packed UAT, seven mutation checks.</w:t>
+            </w:r>
+          </w:p>
+        </w:tc>
+      </w:tr>
+      <w:tr>
+        <w:tc>
+          <w:tcPr>
+            <w:tcW w:type="dxa" w:w="2160"/>
+            <w:vAlign w:val="center"/>
+          </w:tcPr>
+          <w:p>
+            <w:pPr>
+              <w:spacing w:before="0" w:after="0" w:line="276" w:lineRule="auto"/>
+            </w:pPr>
+            <w:r>
+              <w:rPr>
+                <w:rFonts w:ascii="Arial" w:hAnsi="Arial" w:eastAsia="Arial"/>
+                <w:b/>
+                <w:color w:val="000000"/>
+                <w:sz w:val="20"/>
+              </w:rPr>
+              <w:t>Human decision, public result, and remaining limitation</w:t>
+            </w:r>
+          </w:p>
+        </w:tc>
+        <w:tc>
+          <w:tcPr>
+            <w:tcW w:type="dxa" w:w="7200"/>
+            <w:vAlign w:val="center"/>
+          </w:tcPr>
+          <w:p>
+            <w:pPr>
+              <w:spacing w:before="0" w:after="0" w:line="276" w:lineRule="auto"/>
+            </w:pPr>
+            <w:hyperlink r:id="rId37">
+              <w:r>
+                <w:rPr>
+                  <w:rFonts w:ascii="Arial" w:hAnsi="Arial"/>
+                  <w:color w:val="1155CC"/>
+                  <w:u w:val="single"/>
+                </w:rPr>
+                <w:t>PR #715</w:t>
+              </w:r>
+            </w:hyperlink>
+            <w:r>
+              <w:rPr>
+                <w:rFonts w:ascii="Arial" w:hAnsi="Arial" w:eastAsia="Arial"/>
+                <w:color w:val="000000"/>
+                <w:sz w:val="20"/>
+              </w:rPr>
+              <w:t xml:space="preserve">, commit </w:t>
+            </w:r>
+            <w:r>
+              <w:rPr>
+                <w:rFonts w:ascii="Courier New" w:hAnsi="Courier New" w:eastAsia="Courier New"/>
+                <w:color w:val="000000"/>
+                <w:sz w:val="19"/>
+              </w:rPr>
+              <w:t>f931044</w:t>
+            </w:r>
+            <w:r>
+              <w:rPr>
+                <w:rFonts w:ascii="Arial" w:hAnsi="Arial" w:eastAsia="Arial"/>
+                <w:color w:val="000000"/>
+                <w:sz w:val="20"/>
+              </w:rPr>
+              <w:t>. The measured fixture result was 100% scenario relevance and 0% noise; this is not a production-accuracy claim.</w:t>
+            </w:r>
+          </w:p>
+        </w:tc>
+      </w:tr>
+      <w:tr>
+        <w:tc>
+          <w:tcPr>
+            <w:tcW w:type="dxa" w:w="7200"/>
+            <w:gridSpan w:val="2"/>
+            <w:vAlign w:val="center"/>
+          </w:tcPr>
+          <w:p>
+            <w:pPr>
+              <w:keepNext/>
+              <w:spacing w:before="0" w:after="0" w:line="276" w:lineRule="auto"/>
+            </w:pPr>
+            <w:r>
+              <w:rPr>
+                <w:rFonts w:ascii="Arial" w:hAnsi="Arial" w:eastAsia="Arial"/>
+                <w:b/>
+                <w:color w:val="000000"/>
+                <w:sz w:val="20"/>
+              </w:rPr>
+              <w:t>Entry 9 — 27 Jul 2026, 20:18</w:t>
+            </w:r>
+          </w:p>
+        </w:tc>
+      </w:tr>
+      <w:tr>
+        <w:tc>
+          <w:tcPr>
+            <w:tcW w:type="dxa" w:w="2160"/>
+            <w:vAlign w:val="center"/>
+          </w:tcPr>
+          <w:p>
+            <w:pPr>
+              <w:spacing w:before="0" w:after="0" w:line="276" w:lineRule="auto"/>
+            </w:pPr>
+            <w:r>
+              <w:rPr>
+                <w:rFonts w:ascii="Arial" w:hAnsi="Arial" w:eastAsia="Arial"/>
+                <w:b/>
+                <w:color w:val="000000"/>
+                <w:sz w:val="20"/>
+              </w:rPr>
+              <w:t>Issue/task and foundation boundary</w:t>
+            </w:r>
+          </w:p>
+        </w:tc>
+        <w:tc>
+          <w:tcPr>
+            <w:tcW w:type="dxa" w:w="7200"/>
+            <w:vAlign w:val="center"/>
+          </w:tcPr>
+          <w:p>
+            <w:pPr>
+              <w:spacing w:before="0" w:after="0" w:line="276" w:lineRule="auto"/>
+            </w:pPr>
+            <w:hyperlink r:id="rId18">
+              <w:r>
+                <w:rPr>
+                  <w:rFonts w:ascii="Arial" w:hAnsi="Arial"/>
+                  <w:color w:val="1155CC"/>
+                  <w:u w:val="single"/>
+                </w:rPr>
+                <w:t>#696</w:t>
+              </w:r>
+            </w:hyperlink>
+            <w:r>
+              <w:rPr>
+                <w:rFonts w:ascii="Arial" w:hAnsi="Arial" w:eastAsia="Arial"/>
+                <w:color w:val="000000"/>
+                <w:sz w:val="20"/>
+              </w:rPr>
+              <w:t>: the product and deterministic demo fixture existed; the hackathon change captured a genuine Codex repair loop and made its proof inspectable.</w:t>
+            </w:r>
+          </w:p>
+        </w:tc>
+      </w:tr>
+      <w:tr>
+        <w:tc>
+          <w:tcPr>
+            <w:tcW w:type="dxa" w:w="2160"/>
+            <w:vAlign w:val="center"/>
+          </w:tcPr>
+          <w:p>
+            <w:pPr>
+              <w:spacing w:before="0" w:after="0" w:line="276" w:lineRule="auto"/>
+            </w:pPr>
+            <w:r>
+              <w:rPr>
+                <w:rFonts w:ascii="Arial" w:hAnsi="Arial" w:eastAsia="Arial"/>
+                <w:b/>
+                <w:color w:val="000000"/>
+                <w:sz w:val="20"/>
+              </w:rPr>
+              <w:t>Codex surface and public planning evidence</w:t>
+            </w:r>
+          </w:p>
+        </w:tc>
+        <w:tc>
+          <w:tcPr>
+            <w:tcW w:type="dxa" w:w="7200"/>
+            <w:vAlign w:val="center"/>
+          </w:tcPr>
+          <w:p>
+            <w:pPr>
+              <w:spacing w:before="0" w:after="0" w:line="276" w:lineRule="auto"/>
+            </w:pPr>
+            <w:r>
+              <w:rPr>
+                <w:rFonts w:ascii="Arial" w:hAnsi="Arial" w:eastAsia="Arial"/>
+                <w:color w:val="000000"/>
+                <w:sz w:val="20"/>
+              </w:rPr>
+              <w:t>Codex planned the repair, ran the narrow test, used CodeDecay, added a real endpoint test, observed the red auth failure, fixed the route, reran approved checks, and self-reviewed the remaining uncertainty.</w:t>
+            </w:r>
+          </w:p>
+        </w:tc>
+      </w:tr>
+      <w:tr>
+        <w:tc>
+          <w:tcPr>
+            <w:tcW w:type="dxa" w:w="2160"/>
+            <w:vAlign w:val="center"/>
+          </w:tcPr>
+          <w:p>
+            <w:pPr>
+              <w:spacing w:before="0" w:after="0" w:line="276" w:lineRule="auto"/>
+            </w:pPr>
+            <w:r>
+              <w:rPr>
+                <w:rFonts w:ascii="Arial" w:hAnsi="Arial" w:eastAsia="Arial"/>
+                <w:b/>
+                <w:color w:val="000000"/>
+                <w:sz w:val="20"/>
+              </w:rPr>
+              <w:t>Files/components changed</w:t>
+            </w:r>
+          </w:p>
+        </w:tc>
+        <w:tc>
+          <w:tcPr>
+            <w:tcW w:type="dxa" w:w="7200"/>
+            <w:vAlign w:val="center"/>
+          </w:tcPr>
+          <w:p>
+            <w:pPr>
+              <w:spacing w:before="0" w:after="0" w:line="276" w:lineRule="auto"/>
+            </w:pPr>
+            <w:r>
+              <w:rPr>
+                <w:rFonts w:ascii="Arial" w:hAnsi="Arial" w:eastAsia="Arial"/>
+                <w:color w:val="000000"/>
+                <w:sz w:val="20"/>
+              </w:rPr>
+              <w:t>Reproducible fixture, sanitized session JSONL, evidence index, cut disclosure, captions, 159.46-second 1080p video, Judge Lab embed and tests.</w:t>
+            </w:r>
+          </w:p>
+        </w:tc>
+      </w:tr>
+      <w:tr>
+        <w:tc>
+          <w:tcPr>
+            <w:tcW w:type="dxa" w:w="2160"/>
+            <w:vAlign w:val="center"/>
+          </w:tcPr>
+          <w:p>
+            <w:pPr>
+              <w:spacing w:before="0" w:after="0" w:line="276" w:lineRule="auto"/>
+            </w:pPr>
+            <w:r>
+              <w:rPr>
+                <w:rFonts w:ascii="Arial" w:hAnsi="Arial" w:eastAsia="Arial"/>
+                <w:b/>
+                <w:color w:val="000000"/>
+                <w:sz w:val="20"/>
+              </w:rPr>
+              <w:t>Commands and tests executed</w:t>
+            </w:r>
+          </w:p>
+        </w:tc>
+        <w:tc>
+          <w:tcPr>
+            <w:tcW w:type="dxa" w:w="7200"/>
+            <w:vAlign w:val="center"/>
+          </w:tcPr>
+          <w:p>
+            <w:pPr>
+              <w:spacing w:before="0" w:after="0" w:line="276" w:lineRule="auto"/>
+            </w:pPr>
+            <w:r>
+              <w:rPr>
+                <w:rFonts w:ascii="Arial" w:hAnsi="Arial" w:eastAsia="Arial"/>
+                <w:color w:val="000000"/>
+                <w:sz w:val="20"/>
+              </w:rPr>
+              <w:t>Fixture determinism, media probe, 669-test suite, lint, typecheck, build, package dry-run, audits, Judge Lab server and 10 browser tests, GitHub checks.</w:t>
+            </w:r>
+          </w:p>
+        </w:tc>
+      </w:tr>
+      <w:tr>
+        <w:tc>
+          <w:tcPr>
+            <w:tcW w:type="dxa" w:w="2160"/>
+            <w:vAlign w:val="center"/>
+          </w:tcPr>
+          <w:p>
+            <w:pPr>
+              <w:spacing w:before="0" w:after="0" w:line="276" w:lineRule="auto"/>
+            </w:pPr>
+            <w:r>
+              <w:rPr>
+                <w:rFonts w:ascii="Arial" w:hAnsi="Arial" w:eastAsia="Arial"/>
+                <w:b/>
+                <w:color w:val="000000"/>
+                <w:sz w:val="20"/>
+              </w:rPr>
+              <w:t>Human decision, public result, and remaining limitation</w:t>
+            </w:r>
+          </w:p>
+        </w:tc>
+        <w:tc>
+          <w:tcPr>
+            <w:tcW w:type="dxa" w:w="7200"/>
+            <w:vAlign w:val="center"/>
+          </w:tcPr>
+          <w:p>
+            <w:pPr>
+              <w:spacing w:before="0" w:after="0" w:line="276" w:lineRule="auto"/>
+            </w:pPr>
+            <w:hyperlink r:id="rId38">
+              <w:r>
+                <w:rPr>
+                  <w:rFonts w:ascii="Arial" w:hAnsi="Arial"/>
+                  <w:color w:val="1155CC"/>
+                  <w:u w:val="single"/>
+                </w:rPr>
+                <w:t>PR #717</w:t>
+              </w:r>
+            </w:hyperlink>
+            <w:r>
+              <w:rPr>
+                <w:rFonts w:ascii="Arial" w:hAnsi="Arial" w:eastAsia="Arial"/>
+                <w:color w:val="000000"/>
+                <w:sz w:val="20"/>
+              </w:rPr>
+              <w:t xml:space="preserve">, commit </w:t>
+            </w:r>
+            <w:r>
+              <w:rPr>
+                <w:rFonts w:ascii="Courier New" w:hAnsi="Courier New" w:eastAsia="Courier New"/>
+                <w:color w:val="000000"/>
+                <w:sz w:val="19"/>
+              </w:rPr>
+              <w:t>7b85130</w:t>
+            </w:r>
+            <w:r>
+              <w:rPr>
+                <w:rFonts w:ascii="Arial" w:hAnsi="Arial" w:eastAsia="Arial"/>
+                <w:color w:val="000000"/>
+                <w:sz w:val="20"/>
+              </w:rPr>
+              <w:t>. The repaired report remains High because runtime coverage was not supplied; token validity and scope are deliberately not modeled.</w:t>
+            </w:r>
+          </w:p>
+        </w:tc>
+      </w:tr>
+      <w:tr>
+        <w:tc>
+          <w:tcPr>
+            <w:tcW w:type="dxa" w:w="7200"/>
+            <w:gridSpan w:val="2"/>
+            <w:vAlign w:val="center"/>
+          </w:tcPr>
+          <w:p>
+            <w:pPr>
+              <w:keepNext/>
+              <w:spacing w:before="0" w:after="0" w:line="276" w:lineRule="auto"/>
+            </w:pPr>
+            <w:r>
+              <w:rPr>
+                <w:rFonts w:ascii="Arial" w:hAnsi="Arial" w:eastAsia="Arial"/>
+                <w:b/>
+                <w:color w:val="000000"/>
+                <w:sz w:val="20"/>
+              </w:rPr>
+              <w:t>Entry 10 — 27 Jul 2026</w:t>
+            </w:r>
+          </w:p>
+        </w:tc>
+      </w:tr>
+      <w:tr>
+        <w:tc>
+          <w:tcPr>
+            <w:tcW w:type="dxa" w:w="2160"/>
+            <w:vAlign w:val="center"/>
+          </w:tcPr>
+          <w:p>
+            <w:pPr>
+              <w:spacing w:before="0" w:after="0" w:line="276" w:lineRule="auto"/>
+            </w:pPr>
+            <w:r>
+              <w:rPr>
+                <w:rFonts w:ascii="Arial" w:hAnsi="Arial" w:eastAsia="Arial"/>
+                <w:b/>
+                <w:color w:val="000000"/>
+                <w:sz w:val="20"/>
+              </w:rPr>
+              <w:t>Issue/task and foundation boundary</w:t>
+            </w:r>
+          </w:p>
+        </w:tc>
+        <w:tc>
+          <w:tcPr>
+            <w:tcW w:type="dxa" w:w="7200"/>
+            <w:vAlign w:val="center"/>
+          </w:tcPr>
+          <w:p>
+            <w:pPr>
+              <w:spacing w:before="0" w:after="0" w:line="276" w:lineRule="auto"/>
+            </w:pPr>
+            <w:hyperlink r:id="rId16">
               <w:r>
                 <w:rPr>
                   <w:rFonts w:ascii="Arial" w:hAnsi="Arial"/>
@@ -3641,7 +4869,7 @@
               </w:rPr>
               <w:t xml:space="preserve">, </w:t>
             </w:r>
-            <w:hyperlink r:id="rId16">
+            <w:hyperlink r:id="rId18">
               <w:r>
                 <w:rPr>
                   <w:rFonts w:ascii="Arial" w:hAnsi="Arial"/>
@@ -3659,7 +4887,7 @@
               </w:rPr>
               <w:t xml:space="preserve">, </w:t>
             </w:r>
-            <w:hyperlink r:id="rId15">
+            <w:hyperlink r:id="rId17">
               <w:r>
                 <w:rPr>
                   <w:rFonts w:ascii="Arial" w:hAnsi="Arial"/>
@@ -3677,7 +4905,7 @@
               </w:rPr>
               <w:t xml:space="preserve">, </w:t>
             </w:r>
-            <w:hyperlink r:id="rId17">
+            <w:hyperlink r:id="rId19">
               <w:r>
                 <w:rPr>
                   <w:rFonts w:ascii="Arial" w:hAnsi="Arial"/>
@@ -3988,7 +5216,7 @@
           <w:numId w:val="23"/>
         </w:numPr>
       </w:pPr>
-      <w:hyperlink r:id="rId19">
+      <w:hyperlink r:id="rId21">
         <w:r>
           <w:rPr>
             <w:rFonts w:ascii="Arial" w:hAnsi="Arial"/>
@@ -4010,7 +5238,7 @@
           <w:numId w:val="23"/>
         </w:numPr>
       </w:pPr>
-      <w:hyperlink r:id="rId20">
+      <w:hyperlink r:id="rId22">
         <w:r>
           <w:rPr>
             <w:rFonts w:ascii="Arial" w:hAnsi="Arial"/>
@@ -4032,7 +5260,7 @@
           <w:numId w:val="23"/>
         </w:numPr>
       </w:pPr>
-      <w:hyperlink r:id="rId16">
+      <w:hyperlink r:id="rId18">
         <w:r>
           <w:rPr>
             <w:rFonts w:ascii="Arial" w:hAnsi="Arial"/>
@@ -4054,7 +5282,7 @@
           <w:numId w:val="23"/>
         </w:numPr>
       </w:pPr>
-      <w:hyperlink r:id="rId15">
+      <w:hyperlink r:id="rId17">
         <w:r>
           <w:rPr>
             <w:rFonts w:ascii="Arial" w:hAnsi="Arial"/>
@@ -4076,7 +5304,7 @@
           <w:numId w:val="23"/>
         </w:numPr>
       </w:pPr>
-      <w:hyperlink r:id="rId17">
+      <w:hyperlink r:id="rId19">
         <w:r>
           <w:rPr>
             <w:rFonts w:ascii="Arial" w:hAnsi="Arial"/>

</xml_diff>